<commit_message>
feat: permisos transitorios v1
</commit_message>
<xml_diff>
--- a/server/templates/decreto_permisoTransitorio.docx
+++ b/server/templates/decreto_permisoTransitorio.docx
@@ -26,7 +26,7 @@
           <w:lang w:val="es-ES" w:eastAsia="es-ES"/>
           <w14:ligatures w14:val="none"/>
         </w:rPr>
-        <w:t xml:space="preserve">                                                                                      </w:t>
+        <w:t xml:space="preserve">                                                                                     </w:t>
       </w:r>
       <w:r>
         <w:rPr>
@@ -39,20 +39,7 @@
           <w:lang w:val="es-ES" w:eastAsia="es-ES"/>
           <w14:ligatures w14:val="none"/>
         </w:rPr>
-        <w:t xml:space="preserve">        </w:t>
-      </w:r>
-      <w:r>
-        <w:rPr>
-          <w:rFonts w:ascii="Arial" w:eastAsiaTheme="minorEastAsia" w:hAnsi="Arial" w:cs="Arial"/>
-          <w:b/>
-          <w:bCs/>
-          <w:kern w:val="0"/>
-          <w:sz w:val="20"/>
-          <w:szCs w:val="20"/>
-          <w:lang w:val="es-ES" w:eastAsia="es-ES"/>
-          <w14:ligatures w14:val="none"/>
-        </w:rPr>
-        <w:t xml:space="preserve">   </w:t>
+        <w:t xml:space="preserve">    </w:t>
       </w:r>
       <w:r>
         <w:rPr>
@@ -85,8 +72,21 @@
           <w:szCs w:val="20"/>
           <w14:ligatures w14:val="none"/>
         </w:rPr>
-        <w:t xml:space="preserve"> N°</w:t>
-      </w:r>
+        <w:t xml:space="preserve"> </w:t>
+      </w:r>
+      <w:proofErr w:type="spellStart"/>
+      <w:r>
+        <w:rPr>
+          <w:rFonts w:ascii="Arial" w:eastAsia="Calibri" w:hAnsi="Arial" w:cs="Arial"/>
+          <w:b/>
+          <w:kern w:val="0"/>
+          <w:sz w:val="20"/>
+          <w:szCs w:val="20"/>
+          <w14:ligatures w14:val="none"/>
+        </w:rPr>
+        <w:t>N°</w:t>
+      </w:r>
+      <w:proofErr w:type="spellEnd"/>
       <w:r>
         <w:rPr>
           <w:rFonts w:ascii="Arial" w:eastAsia="Calibri" w:hAnsi="Arial" w:cs="Arial"/>
@@ -98,6 +98,7 @@
         </w:rPr>
         <w:t>{</w:t>
       </w:r>
+      <w:proofErr w:type="spellStart"/>
       <w:r>
         <w:rPr>
           <w:rFonts w:ascii="Arial" w:eastAsia="Calibri" w:hAnsi="Arial" w:cs="Arial"/>
@@ -109,6 +110,7 @@
         </w:rPr>
         <w:t>numDecreto</w:t>
       </w:r>
+      <w:proofErr w:type="spellEnd"/>
       <w:r>
         <w:rPr>
           <w:rFonts w:ascii="Arial" w:eastAsia="Calibri" w:hAnsi="Arial" w:cs="Arial"/>
@@ -245,6 +247,7 @@
         </w:rPr>
         <w:t>{</w:t>
       </w:r>
+      <w:proofErr w:type="spellStart"/>
       <w:r>
         <w:rPr>
           <w:rFonts w:ascii="Arial" w:eastAsia="Calibri" w:hAnsi="Arial" w:cs="Arial"/>
@@ -257,6 +260,7 @@
         </w:rPr>
         <w:t>fechaDecreto</w:t>
       </w:r>
+      <w:proofErr w:type="spellEnd"/>
       <w:r>
         <w:rPr>
           <w:rFonts w:ascii="Arial" w:eastAsia="Calibri" w:hAnsi="Arial" w:cs="Arial"/>
@@ -394,12 +398,13 @@
         <w:jc w:val="both"/>
         <w:rPr>
           <w:rFonts w:ascii="Arial" w:eastAsiaTheme="minorEastAsia" w:hAnsi="Arial" w:cs="Arial"/>
+          <w:bCs/>
           <w:iCs/>
           <w:kern w:val="0"/>
           <w:sz w:val="20"/>
           <w:szCs w:val="20"/>
           <w:shd w:val="clear" w:color="auto" w:fill="FFFFFF"/>
-          <w:lang w:val="es-ES" w:eastAsia="es-ES"/>
+          <w:lang w:eastAsia="es-ES"/>
           <w14:ligatures w14:val="none"/>
         </w:rPr>
       </w:pPr>
@@ -495,484 +500,91 @@
       <w:r>
         <w:rPr>
           <w:rFonts w:ascii="Arial" w:eastAsiaTheme="minorEastAsia" w:hAnsi="Arial" w:cs="Arial"/>
+          <w:bCs/>
           <w:iCs/>
           <w:kern w:val="0"/>
           <w:sz w:val="20"/>
           <w:szCs w:val="20"/>
           <w:shd w:val="clear" w:color="auto" w:fill="FFFFFF"/>
-          <w:lang w:val="es-ES" w:eastAsia="es-ES"/>
-          <w14:ligatures w14:val="none"/>
-        </w:rPr>
-        <w:t xml:space="preserve">Los antecedentes, la Sentencia de Calificación y Escrutinio general Elecciones de Alcalde y Acta de Proclamación, en la Causa Rol 23-2021-P, sobre Escrutinio y Calificación al Cargo de Alcalde de la comuna de Chonchi de fecha 02.06.2021, Dictada por el Tribunal Electoral Región de Los Lagos; la Sesión de Instalación del Concejo Municipal, de fecha 28 de junio del 2021, </w:t>
-      </w:r>
-      <w:r>
-        <w:rPr>
-          <w:rFonts w:ascii="Arial" w:eastAsiaTheme="minorEastAsia" w:hAnsi="Arial" w:cs="Arial"/>
-          <w:iCs/>
-          <w:kern w:val="0"/>
-          <w:sz w:val="20"/>
-          <w:szCs w:val="20"/>
-          <w:shd w:val="clear" w:color="auto" w:fill="FFFFFF"/>
-          <w:lang w:val="es-ES" w:eastAsia="es-ES"/>
-          <w14:ligatures w14:val="none"/>
-        </w:rPr>
-        <w:t>Decreto Municipal N° 3119 de fecha 27.09.2024 donde se nombra a doña Paola Andrade Mansilla como Alcaldesa (S)</w:t>
-      </w:r>
-      <w:r>
-        <w:rPr>
-          <w:rFonts w:ascii="Arial" w:eastAsiaTheme="minorEastAsia" w:hAnsi="Arial" w:cs="Arial"/>
-          <w:iCs/>
-          <w:kern w:val="0"/>
-          <w:sz w:val="20"/>
-          <w:szCs w:val="20"/>
-          <w:shd w:val="clear" w:color="auto" w:fill="FFFFFF"/>
-          <w:lang w:val="es-ES" w:eastAsia="es-ES"/>
-          <w14:ligatures w14:val="none"/>
-        </w:rPr>
-        <w:t xml:space="preserve"> y las facultades que me confiere la Ley</w:t>
-      </w:r>
-      <w:r>
-        <w:rPr>
-          <w:rFonts w:ascii="Arial" w:eastAsiaTheme="minorEastAsia" w:hAnsi="Arial" w:cs="Arial"/>
-          <w:iCs/>
-          <w:kern w:val="0"/>
-          <w:sz w:val="20"/>
-          <w:szCs w:val="20"/>
-          <w:shd w:val="clear" w:color="auto" w:fill="FFFFFF"/>
-          <w:lang w:val="es-ES" w:eastAsia="es-ES"/>
-          <w14:ligatures w14:val="none"/>
-        </w:rPr>
-        <w:t xml:space="preserve"> </w:t>
-      </w:r>
-      <w:r>
-        <w:rPr>
-          <w:rFonts w:ascii="Arial" w:eastAsiaTheme="minorEastAsia" w:hAnsi="Arial" w:cs="Arial"/>
-          <w:iCs/>
-          <w:kern w:val="0"/>
-          <w:sz w:val="20"/>
-          <w:szCs w:val="20"/>
-          <w:shd w:val="clear" w:color="auto" w:fill="FFFFFF"/>
-          <w:lang w:val="es-ES" w:eastAsia="es-ES"/>
-          <w14:ligatures w14:val="none"/>
-        </w:rPr>
-        <w:t>Nº 18.695, Orgánica Constitucional de Municipalidades.</w:t>
+          <w:lang w:eastAsia="es-ES"/>
+          <w14:ligatures w14:val="none"/>
+        </w:rPr>
+        <w:t>Los Antecedentes, la Sentencia de calificación y</w:t>
       </w:r>
     </w:p>
     <w:p>
       <w:pPr>
-        <w:spacing w:after="0" w:line="276" w:lineRule="auto"/>
+        <w:spacing w:after="0" w:line="240" w:lineRule="auto"/>
         <w:jc w:val="both"/>
         <w:rPr>
-          <w:rFonts w:ascii="Arial" w:eastAsia="Calibri" w:hAnsi="Arial" w:cs="Arial"/>
-          <w:kern w:val="0"/>
-          <w:sz w:val="20"/>
-          <w:szCs w:val="20"/>
+          <w:rFonts w:ascii="Arial" w:eastAsiaTheme="minorEastAsia" w:hAnsi="Arial" w:cs="Arial"/>
+          <w:bCs/>
+          <w:iCs/>
+          <w:kern w:val="0"/>
+          <w:sz w:val="20"/>
+          <w:szCs w:val="20"/>
+          <w:shd w:val="clear" w:color="auto" w:fill="FFFFFF"/>
+          <w:lang w:eastAsia="es-ES"/>
           <w14:ligatures w14:val="none"/>
         </w:rPr>
       </w:pPr>
       <w:r>
         <w:rPr>
-          <w:rFonts w:ascii="Arial" w:eastAsia="Calibri" w:hAnsi="Arial" w:cs="Arial"/>
-          <w:kern w:val="0"/>
-          <w:sz w:val="20"/>
-          <w:szCs w:val="20"/>
-          <w14:ligatures w14:val="none"/>
-        </w:rPr>
-        <w:tab/>
-      </w:r>
-      <w:r>
-        <w:rPr>
-          <w:rFonts w:ascii="Arial" w:eastAsia="Calibri" w:hAnsi="Arial" w:cs="Arial"/>
-          <w:kern w:val="0"/>
-          <w:sz w:val="20"/>
-          <w:szCs w:val="20"/>
-          <w14:ligatures w14:val="none"/>
-        </w:rPr>
-        <w:tab/>
-      </w:r>
-      <w:r>
-        <w:rPr>
-          <w:rFonts w:ascii="Arial" w:eastAsia="Calibri" w:hAnsi="Arial" w:cs="Arial"/>
-          <w:kern w:val="0"/>
-          <w:sz w:val="20"/>
-          <w:szCs w:val="20"/>
-          <w14:ligatures w14:val="none"/>
-        </w:rPr>
-        <w:tab/>
-      </w:r>
-      <w:r>
-        <w:rPr>
-          <w:rFonts w:ascii="Arial" w:eastAsia="Calibri" w:hAnsi="Arial" w:cs="Arial"/>
-          <w:kern w:val="0"/>
-          <w:sz w:val="20"/>
-          <w:szCs w:val="20"/>
-          <w14:ligatures w14:val="none"/>
-        </w:rPr>
-        <w:tab/>
-      </w:r>
-      <w:r>
-        <w:rPr>
-          <w:rFonts w:ascii="Arial" w:eastAsia="Calibri" w:hAnsi="Arial" w:cs="Arial"/>
-          <w:kern w:val="0"/>
-          <w:sz w:val="20"/>
-          <w:szCs w:val="20"/>
-          <w14:ligatures w14:val="none"/>
-        </w:rPr>
-        <w:tab/>
-      </w:r>
-      <w:r>
-        <w:rPr>
-          <w:rFonts w:ascii="Arial" w:eastAsia="Calibri" w:hAnsi="Arial" w:cs="Arial"/>
-          <w:kern w:val="0"/>
-          <w:sz w:val="20"/>
-          <w:szCs w:val="20"/>
-          <w14:ligatures w14:val="none"/>
-        </w:rPr>
-        <w:tab/>
-      </w:r>
-      <w:r>
-        <w:rPr>
-          <w:rFonts w:ascii="Arial" w:eastAsia="Calibri" w:hAnsi="Arial" w:cs="Arial"/>
-          <w:b/>
-          <w:kern w:val="0"/>
-          <w:sz w:val="20"/>
-          <w:szCs w:val="20"/>
-          <w:u w:val="single"/>
-          <w14:ligatures w14:val="none"/>
-        </w:rPr>
-        <w:t>CONSIDERANDO</w:t>
-      </w:r>
-      <w:r>
-        <w:rPr>
-          <w:rFonts w:ascii="Arial" w:eastAsia="Calibri" w:hAnsi="Arial" w:cs="Arial"/>
-          <w:b/>
-          <w:kern w:val="0"/>
-          <w:sz w:val="20"/>
-          <w:szCs w:val="20"/>
-          <w14:ligatures w14:val="none"/>
-        </w:rPr>
-        <w:t>:</w:t>
+          <w:rFonts w:ascii="Arial" w:eastAsiaTheme="minorEastAsia" w:hAnsi="Arial" w:cs="Arial"/>
+          <w:bCs/>
+          <w:iCs/>
+          <w:kern w:val="0"/>
+          <w:sz w:val="20"/>
+          <w:szCs w:val="20"/>
+          <w:shd w:val="clear" w:color="auto" w:fill="FFFFFF"/>
+          <w:lang w:eastAsia="es-ES"/>
+          <w14:ligatures w14:val="none"/>
+        </w:rPr>
+        <w:t xml:space="preserve">Escrutinio general de Elecciones de Alcalde y Acta de Proclamación, en los Auto ROL 109-2024-P, sobre Escrutinio y Calificación al Cargo del Alcalde de la comuna de Chonchi de fecha 30.11.2024, dictada por el Tribunal Electoral Región de Los Lagos; la Sesión de Instalación del Concejo Municipal, de fecha 06.12.2024, el Decreto Alcaldicio N°835 de 06.12.2024 donde asume el cargo de Alcalde Titular de la Comuna de Chonchi el Sr. Fernando Oyarzun Macías, Decreto Alcaldicio </w:t>
+      </w:r>
+      <w:proofErr w:type="spellStart"/>
+      <w:r>
+        <w:rPr>
+          <w:rFonts w:ascii="Arial" w:eastAsiaTheme="minorEastAsia" w:hAnsi="Arial" w:cs="Arial"/>
+          <w:bCs/>
+          <w:iCs/>
+          <w:kern w:val="0"/>
+          <w:sz w:val="20"/>
+          <w:szCs w:val="20"/>
+          <w:shd w:val="clear" w:color="auto" w:fill="FFFFFF"/>
+          <w:lang w:eastAsia="es-ES"/>
+          <w14:ligatures w14:val="none"/>
+        </w:rPr>
+        <w:t>N°</w:t>
+      </w:r>
+      <w:proofErr w:type="spellEnd"/>
+      <w:r>
+        <w:rPr>
+          <w:rFonts w:ascii="Arial" w:eastAsiaTheme="minorEastAsia" w:hAnsi="Arial" w:cs="Arial"/>
+          <w:bCs/>
+          <w:iCs/>
+          <w:kern w:val="0"/>
+          <w:sz w:val="20"/>
+          <w:szCs w:val="20"/>
+          <w:shd w:val="clear" w:color="auto" w:fill="FFFFFF"/>
+          <w:lang w:eastAsia="es-ES"/>
+          <w14:ligatures w14:val="none"/>
+        </w:rPr>
+        <w:t xml:space="preserve"> 613 de fecha 17.02.25 de subrogancia y las facultades que me confiere la ley 18.695, Orgánica Constitucional de Municipalidades.</w:t>
       </w:r>
     </w:p>
     <w:p>
       <w:pPr>
-        <w:spacing w:after="0" w:line="276" w:lineRule="auto"/>
+        <w:spacing w:after="0" w:line="240" w:lineRule="auto"/>
         <w:jc w:val="both"/>
         <w:rPr>
-          <w:rFonts w:ascii="Arial" w:eastAsia="Calibri" w:hAnsi="Arial" w:cs="Arial"/>
-          <w:kern w:val="0"/>
-          <w:sz w:val="20"/>
-          <w:szCs w:val="20"/>
-          <w14:ligatures w14:val="none"/>
-        </w:rPr>
-      </w:pPr>
-      <w:r>
-        <w:rPr>
-          <w:rFonts w:ascii="Arial" w:eastAsia="Calibri" w:hAnsi="Arial" w:cs="Arial"/>
-          <w:kern w:val="0"/>
-          <w:sz w:val="20"/>
-          <w:szCs w:val="20"/>
-          <w14:ligatures w14:val="none"/>
-        </w:rPr>
-        <w:tab/>
-      </w:r>
-      <w:r>
-        <w:rPr>
-          <w:rFonts w:ascii="Arial" w:eastAsia="Calibri" w:hAnsi="Arial" w:cs="Arial"/>
-          <w:kern w:val="0"/>
-          <w:sz w:val="20"/>
-          <w:szCs w:val="20"/>
-          <w14:ligatures w14:val="none"/>
-        </w:rPr>
-        <w:tab/>
-      </w:r>
-      <w:r>
-        <w:rPr>
-          <w:rFonts w:ascii="Arial" w:eastAsia="Calibri" w:hAnsi="Arial" w:cs="Arial"/>
-          <w:kern w:val="0"/>
-          <w:sz w:val="20"/>
-          <w:szCs w:val="20"/>
-          <w14:ligatures w14:val="none"/>
-        </w:rPr>
-        <w:tab/>
-      </w:r>
-      <w:r>
-        <w:rPr>
-          <w:rFonts w:ascii="Arial" w:eastAsia="Calibri" w:hAnsi="Arial" w:cs="Arial"/>
-          <w:kern w:val="0"/>
-          <w:sz w:val="20"/>
-          <w:szCs w:val="20"/>
-          <w14:ligatures w14:val="none"/>
-        </w:rPr>
-        <w:t xml:space="preserve">                                 </w:t>
-      </w:r>
-    </w:p>
-    <w:p>
-      <w:pPr>
-        <w:spacing w:after="0" w:line="276" w:lineRule="auto"/>
-        <w:jc w:val="both"/>
-        <w:rPr>
-          <w:rFonts w:ascii="Arial" w:eastAsia="Calibri" w:hAnsi="Arial" w:cs="Arial"/>
-          <w:kern w:val="0"/>
-          <w:sz w:val="20"/>
-          <w:szCs w:val="20"/>
-          <w14:ligatures w14:val="none"/>
-        </w:rPr>
-      </w:pPr>
-      <w:r>
-        <w:rPr>
-          <w:rFonts w:ascii="Arial" w:eastAsia="Calibri" w:hAnsi="Arial" w:cs="Arial"/>
-          <w:b/>
-          <w:bCs/>
-          <w:kern w:val="0"/>
-          <w:sz w:val="20"/>
-          <w:szCs w:val="20"/>
-          <w14:ligatures w14:val="none"/>
-        </w:rPr>
-        <w:t xml:space="preserve">                                                                            </w:t>
-      </w:r>
-      <w:r>
-        <w:rPr>
-          <w:rFonts w:ascii="Arial" w:eastAsia="Calibri" w:hAnsi="Arial" w:cs="Arial"/>
-          <w:b/>
-          <w:bCs/>
-          <w:kern w:val="0"/>
-          <w:sz w:val="20"/>
-          <w:szCs w:val="20"/>
-          <w14:ligatures w14:val="none"/>
-        </w:rPr>
-        <w:t>1</w:t>
-      </w:r>
-      <w:r>
-        <w:rPr>
-          <w:rFonts w:ascii="Arial" w:eastAsia="Calibri" w:hAnsi="Arial" w:cs="Arial"/>
-          <w:b/>
-          <w:bCs/>
-          <w:kern w:val="0"/>
-          <w:sz w:val="20"/>
-          <w:szCs w:val="20"/>
-          <w14:ligatures w14:val="none"/>
-        </w:rPr>
-        <w:t>.</w:t>
-      </w:r>
-      <w:r>
-        <w:rPr>
-          <w:rFonts w:ascii="Arial" w:eastAsia="Calibri" w:hAnsi="Arial" w:cs="Arial"/>
-          <w:kern w:val="0"/>
-          <w:sz w:val="20"/>
-          <w:szCs w:val="20"/>
-          <w14:ligatures w14:val="none"/>
-        </w:rPr>
-        <w:t xml:space="preserve">La solicitud por escrito presentada en la Ilustre Municipalidad de Chonchi, por </w:t>
-      </w:r>
-      <w:r>
-        <w:rPr>
-          <w:rFonts w:ascii="Arial" w:eastAsia="Calibri" w:hAnsi="Arial" w:cs="Arial"/>
-          <w:kern w:val="0"/>
-          <w:sz w:val="20"/>
-          <w:szCs w:val="20"/>
-          <w14:ligatures w14:val="none"/>
-        </w:rPr>
-        <w:t>el</w:t>
-      </w:r>
-      <w:r>
-        <w:rPr>
-          <w:rFonts w:ascii="Arial" w:eastAsia="Calibri" w:hAnsi="Arial" w:cs="Arial"/>
-          <w:kern w:val="0"/>
-          <w:sz w:val="20"/>
-          <w:szCs w:val="20"/>
-          <w14:ligatures w14:val="none"/>
-        </w:rPr>
-        <w:t xml:space="preserve"> </w:t>
-      </w:r>
-      <w:r>
-        <w:rPr>
-          <w:rFonts w:ascii="Arial" w:eastAsia="Calibri" w:hAnsi="Arial" w:cs="Arial"/>
-          <w:b/>
-          <w:bCs/>
-          <w:kern w:val="0"/>
-          <w:sz w:val="20"/>
-          <w:szCs w:val="20"/>
-          <w14:ligatures w14:val="none"/>
-        </w:rPr>
-        <w:t>{</w:t>
-      </w:r>
-      <w:r>
-        <w:rPr>
-          <w:rFonts w:ascii="Arial" w:eastAsia="Calibri" w:hAnsi="Arial" w:cs="Arial"/>
-          <w:b/>
-          <w:bCs/>
-          <w:kern w:val="0"/>
-          <w:sz w:val="20"/>
-          <w:szCs w:val="20"/>
-          <w14:ligatures w14:val="none"/>
-        </w:rPr>
-        <w:t>organizacion</w:t>
-      </w:r>
-      <w:r>
-        <w:rPr>
-          <w:rFonts w:ascii="Arial" w:eastAsia="Calibri" w:hAnsi="Arial" w:cs="Arial"/>
-          <w:b/>
-          <w:bCs/>
-          <w:kern w:val="0"/>
-          <w:sz w:val="20"/>
-          <w:szCs w:val="20"/>
-          <w14:ligatures w14:val="none"/>
-        </w:rPr>
-        <w:t>}</w:t>
-      </w:r>
-      <w:r>
-        <w:rPr>
-          <w:rFonts w:ascii="Arial" w:eastAsia="Calibri" w:hAnsi="Arial" w:cs="Arial"/>
-          <w:kern w:val="0"/>
-          <w:sz w:val="20"/>
-          <w:szCs w:val="20"/>
-          <w14:ligatures w14:val="none"/>
-        </w:rPr>
-        <w:t>, Rol Único Tributar</w:t>
-      </w:r>
-      <w:r>
-        <w:rPr>
-          <w:rFonts w:ascii="Arial" w:eastAsia="Calibri" w:hAnsi="Arial" w:cs="Arial"/>
-          <w:kern w:val="0"/>
-          <w:sz w:val="20"/>
-          <w:szCs w:val="20"/>
-          <w14:ligatures w14:val="none"/>
-        </w:rPr>
-        <w:t>io N</w:t>
-      </w:r>
-      <w:r>
-        <w:rPr>
-          <w:rFonts w:ascii="Arial" w:eastAsia="Calibri" w:hAnsi="Arial" w:cs="Arial"/>
-          <w:kern w:val="0"/>
-          <w:sz w:val="20"/>
-          <w:szCs w:val="20"/>
-          <w14:ligatures w14:val="none"/>
-        </w:rPr>
-        <w:t>°</w:t>
-      </w:r>
-      <w:r>
-        <w:rPr>
-          <w:rFonts w:ascii="Arial" w:eastAsia="Calibri" w:hAnsi="Arial" w:cs="Arial"/>
-          <w:b/>
-          <w:bCs/>
-          <w:kern w:val="0"/>
-          <w:sz w:val="20"/>
-          <w:szCs w:val="20"/>
-          <w14:ligatures w14:val="none"/>
-        </w:rPr>
-        <w:t>{</w:t>
-      </w:r>
-      <w:r>
-        <w:rPr>
-          <w:rFonts w:ascii="Arial" w:eastAsia="Calibri" w:hAnsi="Arial" w:cs="Arial"/>
-          <w:b/>
-          <w:bCs/>
-          <w:kern w:val="0"/>
-          <w:sz w:val="20"/>
-          <w:szCs w:val="20"/>
-          <w14:ligatures w14:val="none"/>
-        </w:rPr>
-        <w:t>rutOrganizacion</w:t>
-      </w:r>
-      <w:r>
-        <w:rPr>
-          <w:rFonts w:ascii="Arial" w:eastAsia="Calibri" w:hAnsi="Arial" w:cs="Arial"/>
-          <w:b/>
-          <w:bCs/>
-          <w:kern w:val="0"/>
-          <w:sz w:val="20"/>
-          <w:szCs w:val="20"/>
-          <w14:ligatures w14:val="none"/>
-        </w:rPr>
-        <w:t>}</w:t>
-      </w:r>
-      <w:r>
-        <w:rPr>
-          <w:rFonts w:ascii="Arial" w:eastAsia="Calibri" w:hAnsi="Arial" w:cs="Arial"/>
-          <w:kern w:val="0"/>
-          <w:sz w:val="20"/>
-          <w:szCs w:val="20"/>
-          <w14:ligatures w14:val="none"/>
-        </w:rPr>
-        <w:t>, en donde solicitan permiso para realizar</w:t>
-      </w:r>
-      <w:r>
-        <w:rPr>
-          <w:rFonts w:ascii="Arial" w:eastAsia="Calibri" w:hAnsi="Arial" w:cs="Arial"/>
-          <w:kern w:val="0"/>
-          <w:sz w:val="20"/>
-          <w:szCs w:val="20"/>
-          <w14:ligatures w14:val="none"/>
-        </w:rPr>
-        <w:t xml:space="preserve"> </w:t>
-      </w:r>
-      <w:r>
-        <w:rPr>
-          <w:rFonts w:ascii="Arial" w:eastAsia="Calibri" w:hAnsi="Arial" w:cs="Arial"/>
-          <w:b/>
-          <w:bCs/>
-          <w:kern w:val="0"/>
-          <w:sz w:val="20"/>
-          <w:szCs w:val="20"/>
-          <w14:ligatures w14:val="none"/>
-        </w:rPr>
-        <w:t>{</w:t>
-      </w:r>
-      <w:r>
-        <w:rPr>
-          <w:rFonts w:ascii="Arial" w:eastAsia="Calibri" w:hAnsi="Arial" w:cs="Arial"/>
-          <w:b/>
-          <w:bCs/>
-          <w:kern w:val="0"/>
-          <w:sz w:val="20"/>
-          <w:szCs w:val="20"/>
-          <w14:ligatures w14:val="none"/>
-        </w:rPr>
-        <w:t>actividad</w:t>
-      </w:r>
-      <w:r>
-        <w:rPr>
-          <w:rFonts w:ascii="Arial" w:eastAsia="Calibri" w:hAnsi="Arial" w:cs="Arial"/>
-          <w:b/>
-          <w:bCs/>
-          <w:kern w:val="0"/>
-          <w:sz w:val="20"/>
-          <w:szCs w:val="20"/>
-          <w14:ligatures w14:val="none"/>
-        </w:rPr>
-        <w:t>}</w:t>
-      </w:r>
-      <w:r>
-        <w:rPr>
-          <w:rFonts w:ascii="Arial" w:eastAsia="Calibri" w:hAnsi="Arial" w:cs="Arial"/>
-          <w:kern w:val="0"/>
-          <w:sz w:val="20"/>
-          <w:szCs w:val="20"/>
-          <w14:ligatures w14:val="none"/>
-        </w:rPr>
-        <w:t xml:space="preserve"> con venta de</w:t>
-      </w:r>
-      <w:r>
-        <w:rPr>
-          <w:rFonts w:ascii="Arial" w:eastAsia="Calibri" w:hAnsi="Arial" w:cs="Arial"/>
-          <w:kern w:val="0"/>
-          <w:sz w:val="20"/>
-          <w:szCs w:val="20"/>
-          <w14:ligatures w14:val="none"/>
-        </w:rPr>
-        <w:t xml:space="preserve"> alcohol.</w:t>
-      </w:r>
-    </w:p>
-    <w:p>
-      <w:pPr>
-        <w:spacing w:after="0" w:line="276" w:lineRule="auto"/>
-        <w:jc w:val="both"/>
-        <w:rPr>
-          <w:rFonts w:ascii="Arial" w:eastAsia="Calibri" w:hAnsi="Arial" w:cs="Arial"/>
-          <w:kern w:val="0"/>
-          <w:sz w:val="20"/>
-          <w:szCs w:val="20"/>
+          <w:rFonts w:ascii="Arial" w:eastAsiaTheme="minorEastAsia" w:hAnsi="Arial" w:cs="Arial"/>
+          <w:iCs/>
+          <w:kern w:val="0"/>
+          <w:sz w:val="20"/>
+          <w:szCs w:val="20"/>
+          <w:shd w:val="clear" w:color="auto" w:fill="FFFFFF"/>
+          <w:lang w:val="es-ES" w:eastAsia="es-ES"/>
           <w14:ligatures w14:val="none"/>
         </w:rPr>
       </w:pPr>
@@ -997,71 +609,80 @@
           <w:szCs w:val="20"/>
           <w14:ligatures w14:val="none"/>
         </w:rPr>
-        <w:t xml:space="preserve">                                                                           </w:t>
-      </w:r>
-      <w:r>
-        <w:rPr>
-          <w:rFonts w:ascii="Arial" w:eastAsia="Calibri" w:hAnsi="Arial" w:cs="Arial"/>
-          <w:b/>
-          <w:bCs/>
-          <w:kern w:val="0"/>
-          <w:sz w:val="20"/>
-          <w:szCs w:val="20"/>
-          <w14:ligatures w14:val="none"/>
-        </w:rPr>
-        <w:t xml:space="preserve"> </w:t>
-      </w:r>
-      <w:r>
-        <w:rPr>
-          <w:rFonts w:ascii="Arial" w:eastAsia="Calibri" w:hAnsi="Arial" w:cs="Arial"/>
-          <w:b/>
-          <w:bCs/>
-          <w:kern w:val="0"/>
-          <w:sz w:val="20"/>
-          <w:szCs w:val="20"/>
-          <w14:ligatures w14:val="none"/>
-        </w:rPr>
-        <w:t>2</w:t>
-      </w:r>
-      <w:r>
-        <w:rPr>
-          <w:rFonts w:ascii="Arial" w:eastAsia="Calibri" w:hAnsi="Arial" w:cs="Arial"/>
-          <w:kern w:val="0"/>
-          <w:sz w:val="20"/>
-          <w:szCs w:val="20"/>
-          <w14:ligatures w14:val="none"/>
-        </w:rPr>
-        <w:t>. Ordenanza N° 01 de fecha 09 de abril de 2024 de Alcoholes actualizada de la comuna de Chonchi.</w:t>
-      </w:r>
-      <w:r>
-        <w:rPr>
-          <w:rFonts w:ascii="Arial" w:eastAsia="Calibri" w:hAnsi="Arial" w:cs="Arial"/>
-          <w:kern w:val="0"/>
-          <w:sz w:val="20"/>
-          <w:szCs w:val="20"/>
-          <w14:ligatures w14:val="none"/>
-        </w:rPr>
-        <w:tab/>
-      </w:r>
-      <w:r>
-        <w:rPr>
-          <w:rFonts w:ascii="Arial" w:eastAsia="Calibri" w:hAnsi="Arial" w:cs="Arial"/>
-          <w:kern w:val="0"/>
-          <w:sz w:val="20"/>
-          <w:szCs w:val="20"/>
-          <w14:ligatures w14:val="none"/>
-        </w:rPr>
-        <w:tab/>
-      </w:r>
-      <w:r>
-        <w:rPr>
-          <w:rFonts w:ascii="Arial" w:eastAsia="Calibri" w:hAnsi="Arial" w:cs="Arial"/>
-          <w:kern w:val="0"/>
-          <w:sz w:val="20"/>
-          <w:szCs w:val="20"/>
-          <w14:ligatures w14:val="none"/>
-        </w:rPr>
-        <w:t xml:space="preserve">                                                                                                                </w:t>
+        <w:tab/>
+      </w:r>
+      <w:r>
+        <w:rPr>
+          <w:rFonts w:ascii="Arial" w:eastAsia="Calibri" w:hAnsi="Arial" w:cs="Arial"/>
+          <w:kern w:val="0"/>
+          <w:sz w:val="20"/>
+          <w:szCs w:val="20"/>
+          <w14:ligatures w14:val="none"/>
+        </w:rPr>
+        <w:tab/>
+      </w:r>
+      <w:r>
+        <w:rPr>
+          <w:rFonts w:ascii="Arial" w:eastAsia="Calibri" w:hAnsi="Arial" w:cs="Arial"/>
+          <w:kern w:val="0"/>
+          <w:sz w:val="20"/>
+          <w:szCs w:val="20"/>
+          <w14:ligatures w14:val="none"/>
+        </w:rPr>
+        <w:tab/>
+      </w:r>
+      <w:r>
+        <w:rPr>
+          <w:rFonts w:ascii="Arial" w:eastAsia="Calibri" w:hAnsi="Arial" w:cs="Arial"/>
+          <w:kern w:val="0"/>
+          <w:sz w:val="20"/>
+          <w:szCs w:val="20"/>
+          <w14:ligatures w14:val="none"/>
+        </w:rPr>
+        <w:tab/>
+      </w:r>
+      <w:r>
+        <w:rPr>
+          <w:rFonts w:ascii="Arial" w:eastAsia="Calibri" w:hAnsi="Arial" w:cs="Arial"/>
+          <w:kern w:val="0"/>
+          <w:sz w:val="20"/>
+          <w:szCs w:val="20"/>
+          <w14:ligatures w14:val="none"/>
+        </w:rPr>
+        <w:tab/>
+      </w:r>
+      <w:r>
+        <w:rPr>
+          <w:rFonts w:ascii="Arial" w:eastAsia="Calibri" w:hAnsi="Arial" w:cs="Arial"/>
+          <w:kern w:val="0"/>
+          <w:sz w:val="20"/>
+          <w:szCs w:val="20"/>
+          <w14:ligatures w14:val="none"/>
+        </w:rPr>
+        <w:tab/>
+      </w:r>
+      <w:r>
+        <w:rPr>
+          <w:rFonts w:ascii="Arial" w:eastAsia="Calibri" w:hAnsi="Arial" w:cs="Arial"/>
+          <w:b/>
+          <w:kern w:val="0"/>
+          <w:sz w:val="20"/>
+          <w:szCs w:val="20"/>
+          <w:u w:val="single"/>
+          <w14:ligatures w14:val="none"/>
+        </w:rPr>
+        <w:t>CONSIDERANDO</w:t>
+      </w:r>
+      <w:r>
+        <w:rPr>
+          <w:rFonts w:ascii="Arial" w:eastAsia="Calibri" w:hAnsi="Arial" w:cs="Arial"/>
+          <w:b/>
+          <w:kern w:val="0"/>
+          <w:sz w:val="20"/>
+          <w:szCs w:val="20"/>
+          <w14:ligatures w14:val="none"/>
+        </w:rPr>
+        <w:t>:</w:t>
       </w:r>
     </w:p>
     <w:p>
@@ -1079,86 +700,42 @@
       <w:r>
         <w:rPr>
           <w:rFonts w:ascii="Arial" w:eastAsia="Calibri" w:hAnsi="Arial" w:cs="Arial"/>
-          <w:b/>
-          <w:kern w:val="0"/>
-          <w:sz w:val="20"/>
-          <w:szCs w:val="20"/>
-          <w14:ligatures w14:val="none"/>
-        </w:rPr>
-        <w:t xml:space="preserve">                                                                            </w:t>
-      </w:r>
-      <w:r>
-        <w:rPr>
-          <w:rFonts w:ascii="Arial" w:eastAsia="Calibri" w:hAnsi="Arial" w:cs="Arial"/>
-          <w:b/>
-          <w:kern w:val="0"/>
-          <w:sz w:val="20"/>
-          <w:szCs w:val="20"/>
-          <w14:ligatures w14:val="none"/>
-        </w:rPr>
-        <w:t>3</w:t>
-      </w:r>
-      <w:r>
-        <w:rPr>
-          <w:rFonts w:ascii="Arial" w:eastAsia="Calibri" w:hAnsi="Arial" w:cs="Arial"/>
-          <w:b/>
-          <w:kern w:val="0"/>
-          <w:sz w:val="20"/>
-          <w:szCs w:val="20"/>
-          <w14:ligatures w14:val="none"/>
-        </w:rPr>
-        <w:t>.-</w:t>
-      </w:r>
-      <w:r>
-        <w:rPr>
-          <w:rFonts w:ascii="Arial" w:eastAsia="Calibri" w:hAnsi="Arial" w:cs="Arial"/>
-          <w:b/>
-          <w:kern w:val="0"/>
-          <w:sz w:val="20"/>
-          <w:szCs w:val="20"/>
-          <w14:ligatures w14:val="none"/>
-        </w:rPr>
-        <w:t xml:space="preserve"> </w:t>
-      </w:r>
-      <w:r>
-        <w:rPr>
-          <w:rFonts w:ascii="Arial" w:eastAsia="Calibri" w:hAnsi="Arial" w:cs="Arial"/>
-          <w:kern w:val="0"/>
-          <w:sz w:val="20"/>
-          <w:szCs w:val="20"/>
-          <w14:ligatures w14:val="none"/>
-        </w:rPr>
-        <w:t xml:space="preserve">Ordenanza </w:t>
-      </w:r>
-      <w:r>
-        <w:rPr>
-          <w:rFonts w:ascii="Arial" w:eastAsia="Calibri" w:hAnsi="Arial" w:cs="Arial"/>
-          <w:kern w:val="0"/>
-          <w:sz w:val="20"/>
-          <w:szCs w:val="20"/>
-          <w14:ligatures w14:val="none"/>
-        </w:rPr>
-        <w:t>local por concepto de Derechos Municipales, concesiones o permisos N° 03 de fecha 09 de agosto de 2024.</w:t>
-      </w:r>
-      <w:r>
-        <w:rPr>
-          <w:rFonts w:ascii="Arial" w:eastAsia="Calibri" w:hAnsi="Arial" w:cs="Arial"/>
-          <w:kern w:val="0"/>
-          <w:sz w:val="20"/>
-          <w:szCs w:val="20"/>
-          <w14:ligatures w14:val="none"/>
-        </w:rPr>
-        <w:tab/>
-      </w:r>
-      <w:r>
-        <w:rPr>
-          <w:rFonts w:ascii="Arial" w:eastAsia="Calibri" w:hAnsi="Arial" w:cs="Arial"/>
-          <w:kern w:val="0"/>
-          <w:sz w:val="20"/>
-          <w:szCs w:val="20"/>
-          <w14:ligatures w14:val="none"/>
-        </w:rPr>
-        <w:tab/>
+          <w:kern w:val="0"/>
+          <w:sz w:val="20"/>
+          <w:szCs w:val="20"/>
+          <w14:ligatures w14:val="none"/>
+        </w:rPr>
+        <w:tab/>
+      </w:r>
+      <w:r>
+        <w:rPr>
+          <w:rFonts w:ascii="Arial" w:eastAsia="Calibri" w:hAnsi="Arial" w:cs="Arial"/>
+          <w:kern w:val="0"/>
+          <w:sz w:val="20"/>
+          <w:szCs w:val="20"/>
+          <w14:ligatures w14:val="none"/>
+        </w:rPr>
+        <w:tab/>
+      </w:r>
+      <w:r>
+        <w:rPr>
+          <w:rFonts w:ascii="Arial" w:eastAsia="Calibri" w:hAnsi="Arial" w:cs="Arial"/>
+          <w:kern w:val="0"/>
+          <w:sz w:val="20"/>
+          <w:szCs w:val="20"/>
+          <w14:ligatures w14:val="none"/>
+        </w:rPr>
+        <w:tab/>
+      </w:r>
+      <w:r>
+        <w:rPr>
+          <w:rFonts w:ascii="Arial" w:eastAsia="Calibri" w:hAnsi="Arial" w:cs="Arial"/>
+          <w:kern w:val="0"/>
+          <w:sz w:val="20"/>
+          <w:szCs w:val="20"/>
+          <w14:ligatures w14:val="none"/>
+        </w:rPr>
+        <w:t xml:space="preserve">                                 </w:t>
       </w:r>
     </w:p>
     <w:p>
@@ -1176,62 +753,264 @@
       <w:r>
         <w:rPr>
           <w:rFonts w:ascii="Arial" w:eastAsia="Calibri" w:hAnsi="Arial" w:cs="Arial"/>
-          <w:kern w:val="0"/>
-          <w:sz w:val="20"/>
-          <w:szCs w:val="20"/>
-          <w14:ligatures w14:val="none"/>
-        </w:rPr>
-        <w:tab/>
-      </w:r>
-      <w:r>
-        <w:rPr>
-          <w:rFonts w:ascii="Arial" w:eastAsia="Calibri" w:hAnsi="Arial" w:cs="Arial"/>
-          <w:kern w:val="0"/>
-          <w:sz w:val="20"/>
-          <w:szCs w:val="20"/>
-          <w14:ligatures w14:val="none"/>
-        </w:rPr>
-        <w:tab/>
-      </w:r>
-      <w:r>
-        <w:rPr>
-          <w:rFonts w:ascii="Arial" w:eastAsia="Calibri" w:hAnsi="Arial" w:cs="Arial"/>
-          <w:kern w:val="0"/>
-          <w:sz w:val="20"/>
-          <w:szCs w:val="20"/>
-          <w14:ligatures w14:val="none"/>
-        </w:rPr>
-        <w:tab/>
-      </w:r>
-      <w:r>
-        <w:rPr>
-          <w:rFonts w:ascii="Arial" w:eastAsia="Calibri" w:hAnsi="Arial" w:cs="Arial"/>
-          <w:kern w:val="0"/>
-          <w:sz w:val="20"/>
-          <w:szCs w:val="20"/>
-          <w14:ligatures w14:val="none"/>
-        </w:rPr>
-        <w:tab/>
-      </w:r>
-      <w:r>
-        <w:rPr>
-          <w:rFonts w:ascii="Arial" w:eastAsia="Calibri" w:hAnsi="Arial" w:cs="Arial"/>
-          <w:kern w:val="0"/>
-          <w:sz w:val="20"/>
-          <w:szCs w:val="20"/>
-          <w14:ligatures w14:val="none"/>
-        </w:rPr>
-        <w:tab/>
-      </w:r>
-      <w:r>
-        <w:rPr>
-          <w:rFonts w:ascii="Arial" w:eastAsia="Calibri" w:hAnsi="Arial" w:cs="Arial"/>
-          <w:kern w:val="0"/>
-          <w:sz w:val="20"/>
-          <w:szCs w:val="20"/>
-          <w14:ligatures w14:val="none"/>
-        </w:rPr>
-        <w:tab/>
+          <w:b/>
+          <w:bCs/>
+          <w:kern w:val="0"/>
+          <w:sz w:val="20"/>
+          <w:szCs w:val="20"/>
+          <w14:ligatures w14:val="none"/>
+        </w:rPr>
+        <w:t xml:space="preserve">                                                                            </w:t>
+      </w:r>
+      <w:r>
+        <w:rPr>
+          <w:rFonts w:ascii="Arial" w:eastAsia="Calibri" w:hAnsi="Arial" w:cs="Arial"/>
+          <w:b/>
+          <w:bCs/>
+          <w:kern w:val="0"/>
+          <w:sz w:val="20"/>
+          <w:szCs w:val="20"/>
+          <w14:ligatures w14:val="none"/>
+        </w:rPr>
+        <w:t>1</w:t>
+      </w:r>
+      <w:r>
+        <w:rPr>
+          <w:rFonts w:ascii="Arial" w:eastAsia="Calibri" w:hAnsi="Arial" w:cs="Arial"/>
+          <w:b/>
+          <w:bCs/>
+          <w:kern w:val="0"/>
+          <w:sz w:val="20"/>
+          <w:szCs w:val="20"/>
+          <w14:ligatures w14:val="none"/>
+        </w:rPr>
+        <w:t>.</w:t>
+      </w:r>
+      <w:r>
+        <w:rPr>
+          <w:rFonts w:ascii="Arial" w:eastAsia="Calibri" w:hAnsi="Arial" w:cs="Arial"/>
+          <w:b/>
+          <w:bCs/>
+          <w:kern w:val="0"/>
+          <w:sz w:val="20"/>
+          <w:szCs w:val="20"/>
+          <w14:ligatures w14:val="none"/>
+        </w:rPr>
+        <w:t xml:space="preserve"> </w:t>
+      </w:r>
+      <w:r>
+        <w:rPr>
+          <w:rFonts w:ascii="Arial" w:eastAsia="Calibri" w:hAnsi="Arial" w:cs="Arial"/>
+          <w:kern w:val="0"/>
+          <w:sz w:val="20"/>
+          <w:szCs w:val="20"/>
+          <w14:ligatures w14:val="none"/>
+        </w:rPr>
+        <w:t>La solicitud presentada en la Ilustre Municipalidad de Chonchi, por</w:t>
+      </w:r>
+      <w:r>
+        <w:rPr>
+          <w:rFonts w:ascii="Arial" w:eastAsia="Calibri" w:hAnsi="Arial" w:cs="Arial"/>
+          <w:kern w:val="0"/>
+          <w:sz w:val="20"/>
+          <w:szCs w:val="20"/>
+          <w14:ligatures w14:val="none"/>
+        </w:rPr>
+        <w:t xml:space="preserve"> </w:t>
+      </w:r>
+      <w:r>
+        <w:rPr>
+          <w:rFonts w:ascii="Arial" w:eastAsia="Calibri" w:hAnsi="Arial" w:cs="Arial"/>
+          <w:b/>
+          <w:bCs/>
+          <w:kern w:val="0"/>
+          <w:sz w:val="20"/>
+          <w:szCs w:val="20"/>
+          <w14:ligatures w14:val="none"/>
+        </w:rPr>
+        <w:t>{</w:t>
+      </w:r>
+      <w:proofErr w:type="spellStart"/>
+      <w:r>
+        <w:rPr>
+          <w:rFonts w:ascii="Arial" w:eastAsia="Calibri" w:hAnsi="Arial" w:cs="Arial"/>
+          <w:b/>
+          <w:bCs/>
+          <w:kern w:val="0"/>
+          <w:sz w:val="20"/>
+          <w:szCs w:val="20"/>
+          <w14:ligatures w14:val="none"/>
+        </w:rPr>
+        <w:t>organizacion</w:t>
+      </w:r>
+      <w:proofErr w:type="spellEnd"/>
+      <w:r>
+        <w:rPr>
+          <w:rFonts w:ascii="Arial" w:eastAsia="Calibri" w:hAnsi="Arial" w:cs="Arial"/>
+          <w:b/>
+          <w:bCs/>
+          <w:kern w:val="0"/>
+          <w:sz w:val="20"/>
+          <w:szCs w:val="20"/>
+          <w14:ligatures w14:val="none"/>
+        </w:rPr>
+        <w:t>}</w:t>
+      </w:r>
+      <w:r>
+        <w:rPr>
+          <w:rFonts w:ascii="Arial" w:eastAsia="Calibri" w:hAnsi="Arial" w:cs="Arial"/>
+          <w:kern w:val="0"/>
+          <w:sz w:val="20"/>
+          <w:szCs w:val="20"/>
+          <w14:ligatures w14:val="none"/>
+        </w:rPr>
+        <w:t>, Rol Único Tributar</w:t>
+      </w:r>
+      <w:r>
+        <w:rPr>
+          <w:rFonts w:ascii="Arial" w:eastAsia="Calibri" w:hAnsi="Arial" w:cs="Arial"/>
+          <w:kern w:val="0"/>
+          <w:sz w:val="20"/>
+          <w:szCs w:val="20"/>
+          <w14:ligatures w14:val="none"/>
+        </w:rPr>
+        <w:t xml:space="preserve">io </w:t>
+      </w:r>
+      <w:proofErr w:type="spellStart"/>
+      <w:r>
+        <w:rPr>
+          <w:rFonts w:ascii="Arial" w:eastAsia="Calibri" w:hAnsi="Arial" w:cs="Arial"/>
+          <w:kern w:val="0"/>
+          <w:sz w:val="20"/>
+          <w:szCs w:val="20"/>
+          <w14:ligatures w14:val="none"/>
+        </w:rPr>
+        <w:t>N</w:t>
+      </w:r>
+      <w:r>
+        <w:rPr>
+          <w:rFonts w:ascii="Arial" w:eastAsia="Calibri" w:hAnsi="Arial" w:cs="Arial"/>
+          <w:kern w:val="0"/>
+          <w:sz w:val="20"/>
+          <w:szCs w:val="20"/>
+          <w14:ligatures w14:val="none"/>
+        </w:rPr>
+        <w:t>°</w:t>
+      </w:r>
+      <w:proofErr w:type="spellEnd"/>
+      <w:r>
+        <w:rPr>
+          <w:rFonts w:ascii="Arial" w:eastAsia="Calibri" w:hAnsi="Arial" w:cs="Arial"/>
+          <w:b/>
+          <w:bCs/>
+          <w:kern w:val="0"/>
+          <w:sz w:val="20"/>
+          <w:szCs w:val="20"/>
+          <w14:ligatures w14:val="none"/>
+        </w:rPr>
+        <w:t>{</w:t>
+      </w:r>
+      <w:proofErr w:type="spellStart"/>
+      <w:r>
+        <w:rPr>
+          <w:rFonts w:ascii="Arial" w:eastAsia="Calibri" w:hAnsi="Arial" w:cs="Arial"/>
+          <w:b/>
+          <w:bCs/>
+          <w:kern w:val="0"/>
+          <w:sz w:val="20"/>
+          <w:szCs w:val="20"/>
+          <w14:ligatures w14:val="none"/>
+        </w:rPr>
+        <w:t>rutOrganizacion</w:t>
+      </w:r>
+      <w:proofErr w:type="spellEnd"/>
+      <w:r>
+        <w:rPr>
+          <w:rFonts w:ascii="Arial" w:eastAsia="Calibri" w:hAnsi="Arial" w:cs="Arial"/>
+          <w:b/>
+          <w:bCs/>
+          <w:kern w:val="0"/>
+          <w:sz w:val="20"/>
+          <w:szCs w:val="20"/>
+          <w14:ligatures w14:val="none"/>
+        </w:rPr>
+        <w:t>}</w:t>
+      </w:r>
+      <w:r>
+        <w:rPr>
+          <w:rFonts w:ascii="Arial" w:eastAsia="Calibri" w:hAnsi="Arial" w:cs="Arial"/>
+          <w:kern w:val="0"/>
+          <w:sz w:val="20"/>
+          <w:szCs w:val="20"/>
+          <w14:ligatures w14:val="none"/>
+        </w:rPr>
+        <w:t>, en donde solicitan permiso para realizar</w:t>
+      </w:r>
+      <w:r>
+        <w:rPr>
+          <w:rFonts w:ascii="Arial" w:eastAsia="Calibri" w:hAnsi="Arial" w:cs="Arial"/>
+          <w:kern w:val="0"/>
+          <w:sz w:val="20"/>
+          <w:szCs w:val="20"/>
+          <w14:ligatures w14:val="none"/>
+        </w:rPr>
+        <w:t xml:space="preserve"> </w:t>
+      </w:r>
+      <w:r>
+        <w:rPr>
+          <w:rFonts w:ascii="Arial" w:eastAsia="Calibri" w:hAnsi="Arial" w:cs="Arial"/>
+          <w:b/>
+          <w:bCs/>
+          <w:kern w:val="0"/>
+          <w:sz w:val="20"/>
+          <w:szCs w:val="20"/>
+          <w14:ligatures w14:val="none"/>
+        </w:rPr>
+        <w:t>{</w:t>
+      </w:r>
+      <w:r>
+        <w:rPr>
+          <w:rFonts w:ascii="Arial" w:eastAsia="Calibri" w:hAnsi="Arial" w:cs="Arial"/>
+          <w:b/>
+          <w:bCs/>
+          <w:kern w:val="0"/>
+          <w:sz w:val="20"/>
+          <w:szCs w:val="20"/>
+          <w14:ligatures w14:val="none"/>
+        </w:rPr>
+        <w:t>actividad</w:t>
+      </w:r>
+      <w:r>
+        <w:rPr>
+          <w:rFonts w:ascii="Arial" w:eastAsia="Calibri" w:hAnsi="Arial" w:cs="Arial"/>
+          <w:b/>
+          <w:bCs/>
+          <w:kern w:val="0"/>
+          <w:sz w:val="20"/>
+          <w:szCs w:val="20"/>
+          <w14:ligatures w14:val="none"/>
+        </w:rPr>
+        <w:t>}</w:t>
+      </w:r>
+      <w:r>
+        <w:rPr>
+          <w:rFonts w:ascii="Arial" w:eastAsia="Calibri" w:hAnsi="Arial" w:cs="Arial"/>
+          <w:kern w:val="0"/>
+          <w:sz w:val="20"/>
+          <w:szCs w:val="20"/>
+          <w14:ligatures w14:val="none"/>
+        </w:rPr>
+        <w:t xml:space="preserve"> con venta de</w:t>
+      </w:r>
+      <w:r>
+        <w:rPr>
+          <w:rFonts w:ascii="Arial" w:eastAsia="Calibri" w:hAnsi="Arial" w:cs="Arial"/>
+          <w:kern w:val="0"/>
+          <w:sz w:val="20"/>
+          <w:szCs w:val="20"/>
+          <w14:ligatures w14:val="none"/>
+        </w:rPr>
+        <w:t xml:space="preserve"> alcohol.</w:t>
       </w:r>
     </w:p>
     <w:p>
@@ -1240,96 +1019,12 @@
         <w:jc w:val="both"/>
         <w:rPr>
           <w:rFonts w:ascii="Arial" w:eastAsia="Calibri" w:hAnsi="Arial" w:cs="Arial"/>
-          <w:b/>
           <w:kern w:val="0"/>
           <w:sz w:val="20"/>
           <w:szCs w:val="20"/>
           <w14:ligatures w14:val="none"/>
         </w:rPr>
       </w:pPr>
-      <w:r>
-        <w:rPr>
-          <w:rFonts w:ascii="Arial" w:eastAsia="Calibri" w:hAnsi="Arial" w:cs="Arial"/>
-          <w:kern w:val="0"/>
-          <w:sz w:val="20"/>
-          <w:szCs w:val="20"/>
-          <w14:ligatures w14:val="none"/>
-        </w:rPr>
-        <w:tab/>
-      </w:r>
-      <w:r>
-        <w:rPr>
-          <w:rFonts w:ascii="Arial" w:eastAsia="Calibri" w:hAnsi="Arial" w:cs="Arial"/>
-          <w:kern w:val="0"/>
-          <w:sz w:val="20"/>
-          <w:szCs w:val="20"/>
-          <w14:ligatures w14:val="none"/>
-        </w:rPr>
-        <w:tab/>
-      </w:r>
-      <w:r>
-        <w:rPr>
-          <w:rFonts w:ascii="Arial" w:eastAsia="Calibri" w:hAnsi="Arial" w:cs="Arial"/>
-          <w:kern w:val="0"/>
-          <w:sz w:val="20"/>
-          <w:szCs w:val="20"/>
-          <w14:ligatures w14:val="none"/>
-        </w:rPr>
-        <w:tab/>
-      </w:r>
-      <w:r>
-        <w:rPr>
-          <w:rFonts w:ascii="Arial" w:eastAsia="Calibri" w:hAnsi="Arial" w:cs="Arial"/>
-          <w:kern w:val="0"/>
-          <w:sz w:val="20"/>
-          <w:szCs w:val="20"/>
-          <w14:ligatures w14:val="none"/>
-        </w:rPr>
-        <w:tab/>
-      </w:r>
-      <w:r>
-        <w:rPr>
-          <w:rFonts w:ascii="Arial" w:eastAsia="Calibri" w:hAnsi="Arial" w:cs="Arial"/>
-          <w:kern w:val="0"/>
-          <w:sz w:val="20"/>
-          <w:szCs w:val="20"/>
-          <w14:ligatures w14:val="none"/>
-        </w:rPr>
-        <w:tab/>
-      </w:r>
-      <w:r>
-        <w:rPr>
-          <w:rFonts w:ascii="Arial" w:eastAsia="Calibri" w:hAnsi="Arial" w:cs="Arial"/>
-          <w:kern w:val="0"/>
-          <w:sz w:val="20"/>
-          <w:szCs w:val="20"/>
-          <w14:ligatures w14:val="none"/>
-        </w:rPr>
-        <w:tab/>
-      </w:r>
-      <w:r>
-        <w:rPr>
-          <w:rFonts w:ascii="Arial" w:eastAsia="Calibri" w:hAnsi="Arial" w:cs="Arial"/>
-          <w:b/>
-          <w:kern w:val="0"/>
-          <w:sz w:val="20"/>
-          <w:szCs w:val="20"/>
-          <w:u w:val="single"/>
-          <w14:ligatures w14:val="none"/>
-        </w:rPr>
-        <w:t>DECRETO</w:t>
-      </w:r>
-      <w:r>
-        <w:rPr>
-          <w:rFonts w:ascii="Arial" w:eastAsia="Calibri" w:hAnsi="Arial" w:cs="Arial"/>
-          <w:b/>
-          <w:kern w:val="0"/>
-          <w:sz w:val="20"/>
-          <w:szCs w:val="20"/>
-          <w14:ligatures w14:val="none"/>
-        </w:rPr>
-        <w:t>:</w:t>
-      </w:r>
     </w:p>
     <w:p>
       <w:pPr>
@@ -1337,7 +1032,6 @@
         <w:jc w:val="both"/>
         <w:rPr>
           <w:rFonts w:ascii="Arial" w:eastAsia="Calibri" w:hAnsi="Arial" w:cs="Arial"/>
-          <w:b/>
           <w:kern w:val="0"/>
           <w:sz w:val="20"/>
           <w:szCs w:val="20"/>
@@ -1347,7 +1041,82 @@
       <w:r>
         <w:rPr>
           <w:rFonts w:ascii="Arial" w:eastAsia="Calibri" w:hAnsi="Arial" w:cs="Arial"/>
-          <w:b/>
+          <w:kern w:val="0"/>
+          <w:sz w:val="20"/>
+          <w:szCs w:val="20"/>
+          <w14:ligatures w14:val="none"/>
+        </w:rPr>
+        <w:t xml:space="preserve">                                                                           </w:t>
+      </w:r>
+      <w:r>
+        <w:rPr>
+          <w:rFonts w:ascii="Arial" w:eastAsia="Calibri" w:hAnsi="Arial" w:cs="Arial"/>
+          <w:b/>
+          <w:bCs/>
+          <w:kern w:val="0"/>
+          <w:sz w:val="20"/>
+          <w:szCs w:val="20"/>
+          <w14:ligatures w14:val="none"/>
+        </w:rPr>
+        <w:t xml:space="preserve"> </w:t>
+      </w:r>
+      <w:r>
+        <w:rPr>
+          <w:rFonts w:ascii="Arial" w:eastAsia="Calibri" w:hAnsi="Arial" w:cs="Arial"/>
+          <w:b/>
+          <w:bCs/>
+          <w:kern w:val="0"/>
+          <w:sz w:val="20"/>
+          <w:szCs w:val="20"/>
+          <w14:ligatures w14:val="none"/>
+        </w:rPr>
+        <w:t>2</w:t>
+      </w:r>
+      <w:r>
+        <w:rPr>
+          <w:rFonts w:ascii="Arial" w:eastAsia="Calibri" w:hAnsi="Arial" w:cs="Arial"/>
+          <w:kern w:val="0"/>
+          <w:sz w:val="20"/>
+          <w:szCs w:val="20"/>
+          <w14:ligatures w14:val="none"/>
+        </w:rPr>
+        <w:t xml:space="preserve">. </w:t>
+      </w:r>
+      <w:r>
+        <w:rPr>
+          <w:rFonts w:ascii="Arial" w:eastAsia="Calibri" w:hAnsi="Arial" w:cs="Arial"/>
+          <w:kern w:val="0"/>
+          <w:sz w:val="20"/>
+          <w:szCs w:val="20"/>
+          <w14:ligatures w14:val="none"/>
+        </w:rPr>
+        <w:t xml:space="preserve">Ordenanza </w:t>
+      </w:r>
+      <w:proofErr w:type="spellStart"/>
+      <w:r>
+        <w:rPr>
+          <w:rFonts w:ascii="Arial" w:eastAsia="Calibri" w:hAnsi="Arial" w:cs="Arial"/>
+          <w:kern w:val="0"/>
+          <w:sz w:val="20"/>
+          <w:szCs w:val="20"/>
+          <w14:ligatures w14:val="none"/>
+        </w:rPr>
+        <w:t>N°</w:t>
+      </w:r>
+      <w:proofErr w:type="spellEnd"/>
+      <w:r>
+        <w:rPr>
+          <w:rFonts w:ascii="Arial" w:eastAsia="Calibri" w:hAnsi="Arial" w:cs="Arial"/>
+          <w:kern w:val="0"/>
+          <w:sz w:val="20"/>
+          <w:szCs w:val="20"/>
+          <w14:ligatures w14:val="none"/>
+        </w:rPr>
+        <w:t xml:space="preserve"> 07 de fecha 12 de noviembre 2024 de Alcoholes actualizada de la comuna de Chonchi.</w:t>
+      </w:r>
+      <w:r>
+        <w:rPr>
+          <w:rFonts w:ascii="Arial" w:eastAsia="Calibri" w:hAnsi="Arial" w:cs="Arial"/>
           <w:kern w:val="0"/>
           <w:sz w:val="20"/>
           <w:szCs w:val="20"/>
@@ -1371,6 +1140,39 @@
       <w:r>
         <w:rPr>
           <w:rFonts w:ascii="Arial" w:eastAsia="Calibri" w:hAnsi="Arial" w:cs="Arial"/>
+          <w:kern w:val="0"/>
+          <w:sz w:val="20"/>
+          <w:szCs w:val="20"/>
+          <w14:ligatures w14:val="none"/>
+        </w:rPr>
+        <w:tab/>
+      </w:r>
+      <w:r>
+        <w:rPr>
+          <w:rFonts w:ascii="Arial" w:eastAsia="Calibri" w:hAnsi="Arial" w:cs="Arial"/>
+          <w:kern w:val="0"/>
+          <w:sz w:val="20"/>
+          <w:szCs w:val="20"/>
+          <w14:ligatures w14:val="none"/>
+        </w:rPr>
+        <w:t xml:space="preserve">                                                                                                                </w:t>
+      </w:r>
+    </w:p>
+    <w:p>
+      <w:pPr>
+        <w:spacing w:after="0" w:line="276" w:lineRule="auto"/>
+        <w:jc w:val="both"/>
+        <w:rPr>
+          <w:rFonts w:ascii="Arial" w:eastAsia="Calibri" w:hAnsi="Arial" w:cs="Arial"/>
+          <w:kern w:val="0"/>
+          <w:sz w:val="20"/>
+          <w:szCs w:val="20"/>
+          <w14:ligatures w14:val="none"/>
+        </w:rPr>
+      </w:pPr>
+      <w:r>
+        <w:rPr>
+          <w:rFonts w:ascii="Arial" w:eastAsia="Calibri" w:hAnsi="Arial" w:cs="Arial"/>
           <w:b/>
           <w:kern w:val="0"/>
           <w:sz w:val="20"/>
@@ -1388,6 +1190,367 @@
           <w:szCs w:val="20"/>
           <w14:ligatures w14:val="none"/>
         </w:rPr>
+        <w:t>3</w:t>
+      </w:r>
+      <w:r>
+        <w:rPr>
+          <w:rFonts w:ascii="Arial" w:eastAsia="Calibri" w:hAnsi="Arial" w:cs="Arial"/>
+          <w:b/>
+          <w:kern w:val="0"/>
+          <w:sz w:val="20"/>
+          <w:szCs w:val="20"/>
+          <w14:ligatures w14:val="none"/>
+        </w:rPr>
+        <w:t>.</w:t>
+      </w:r>
+      <w:r>
+        <w:rPr>
+          <w:rFonts w:ascii="Arial" w:eastAsia="Calibri" w:hAnsi="Arial" w:cs="Arial"/>
+          <w:b/>
+          <w:kern w:val="0"/>
+          <w:sz w:val="20"/>
+          <w:szCs w:val="20"/>
+          <w14:ligatures w14:val="none"/>
+        </w:rPr>
+        <w:t xml:space="preserve"> </w:t>
+      </w:r>
+      <w:r>
+        <w:rPr>
+          <w:rFonts w:ascii="Arial" w:eastAsia="Calibri" w:hAnsi="Arial" w:cs="Arial"/>
+          <w:kern w:val="0"/>
+          <w:sz w:val="20"/>
+          <w:szCs w:val="20"/>
+          <w14:ligatures w14:val="none"/>
+        </w:rPr>
+        <w:t xml:space="preserve">Artículo 26 de la Ordenanza local por concepto de Derechos Municipales, concesiones o permisos </w:t>
+      </w:r>
+      <w:proofErr w:type="spellStart"/>
+      <w:r>
+        <w:rPr>
+          <w:rFonts w:ascii="Arial" w:eastAsia="Calibri" w:hAnsi="Arial" w:cs="Arial"/>
+          <w:kern w:val="0"/>
+          <w:sz w:val="20"/>
+          <w:szCs w:val="20"/>
+          <w14:ligatures w14:val="none"/>
+        </w:rPr>
+        <w:t>N°</w:t>
+      </w:r>
+      <w:proofErr w:type="spellEnd"/>
+      <w:r>
+        <w:rPr>
+          <w:rFonts w:ascii="Arial" w:eastAsia="Calibri" w:hAnsi="Arial" w:cs="Arial"/>
+          <w:kern w:val="0"/>
+          <w:sz w:val="20"/>
+          <w:szCs w:val="20"/>
+          <w14:ligatures w14:val="none"/>
+        </w:rPr>
+        <w:t xml:space="preserve"> 05 de fecha 29 de octubre de 2024.</w:t>
+      </w:r>
+    </w:p>
+    <w:p>
+      <w:pPr>
+        <w:spacing w:after="0" w:line="276" w:lineRule="auto"/>
+        <w:jc w:val="both"/>
+        <w:rPr>
+          <w:rFonts w:ascii="Arial" w:eastAsia="Calibri" w:hAnsi="Arial" w:cs="Arial"/>
+          <w:kern w:val="0"/>
+          <w:sz w:val="20"/>
+          <w:szCs w:val="20"/>
+          <w14:ligatures w14:val="none"/>
+        </w:rPr>
+      </w:pPr>
+    </w:p>
+    <w:p>
+      <w:pPr>
+        <w:spacing w:after="0" w:line="276" w:lineRule="auto"/>
+        <w:ind w:firstLine="4253"/>
+        <w:jc w:val="both"/>
+        <w:rPr>
+          <w:rFonts w:ascii="Arial" w:eastAsia="Calibri" w:hAnsi="Arial" w:cs="Arial"/>
+          <w:kern w:val="0"/>
+          <w:sz w:val="20"/>
+          <w:szCs w:val="20"/>
+          <w14:ligatures w14:val="none"/>
+        </w:rPr>
+      </w:pPr>
+      <w:r>
+        <w:rPr>
+          <w:rFonts w:ascii="Arial" w:eastAsia="Calibri" w:hAnsi="Arial" w:cs="Arial"/>
+          <w:kern w:val="0"/>
+          <w:sz w:val="20"/>
+          <w:szCs w:val="20"/>
+          <w14:ligatures w14:val="none"/>
+        </w:rPr>
+        <w:t>4.</w:t>
+      </w:r>
+      <w:r>
+        <w:rPr>
+          <w:rFonts w:ascii="Arial" w:eastAsia="Calibri" w:hAnsi="Arial" w:cs="Arial"/>
+          <w:kern w:val="0"/>
+          <w:sz w:val="20"/>
+          <w:szCs w:val="20"/>
+          <w14:ligatures w14:val="none"/>
+        </w:rPr>
+        <w:t xml:space="preserve"> </w:t>
+      </w:r>
+      <w:r>
+        <w:rPr>
+          <w:rFonts w:ascii="Arial" w:eastAsia="Calibri" w:hAnsi="Arial" w:cs="Arial"/>
+          <w:kern w:val="0"/>
+          <w:sz w:val="20"/>
+          <w:szCs w:val="20"/>
+          <w14:ligatures w14:val="none"/>
+        </w:rPr>
+        <w:t>Considerando autorización del Servicio de impuestos internos (Formulario 21).</w:t>
+      </w:r>
+      <w:r>
+        <w:rPr>
+          <w:rFonts w:ascii="Arial" w:eastAsia="Calibri" w:hAnsi="Arial" w:cs="Arial"/>
+          <w:kern w:val="0"/>
+          <w:sz w:val="20"/>
+          <w:szCs w:val="20"/>
+          <w14:ligatures w14:val="none"/>
+        </w:rPr>
+        <w:tab/>
+      </w:r>
+      <w:r>
+        <w:rPr>
+          <w:rFonts w:ascii="Arial" w:eastAsia="Calibri" w:hAnsi="Arial" w:cs="Arial"/>
+          <w:kern w:val="0"/>
+          <w:sz w:val="20"/>
+          <w:szCs w:val="20"/>
+          <w14:ligatures w14:val="none"/>
+        </w:rPr>
+        <w:tab/>
+      </w:r>
+    </w:p>
+    <w:p>
+      <w:pPr>
+        <w:spacing w:after="0" w:line="276" w:lineRule="auto"/>
+        <w:jc w:val="both"/>
+        <w:rPr>
+          <w:rFonts w:ascii="Arial" w:eastAsia="Calibri" w:hAnsi="Arial" w:cs="Arial"/>
+          <w:kern w:val="0"/>
+          <w:sz w:val="20"/>
+          <w:szCs w:val="20"/>
+          <w14:ligatures w14:val="none"/>
+        </w:rPr>
+      </w:pPr>
+      <w:r>
+        <w:rPr>
+          <w:rFonts w:ascii="Arial" w:eastAsia="Calibri" w:hAnsi="Arial" w:cs="Arial"/>
+          <w:kern w:val="0"/>
+          <w:sz w:val="20"/>
+          <w:szCs w:val="20"/>
+          <w14:ligatures w14:val="none"/>
+        </w:rPr>
+        <w:tab/>
+      </w:r>
+      <w:r>
+        <w:rPr>
+          <w:rFonts w:ascii="Arial" w:eastAsia="Calibri" w:hAnsi="Arial" w:cs="Arial"/>
+          <w:kern w:val="0"/>
+          <w:sz w:val="20"/>
+          <w:szCs w:val="20"/>
+          <w14:ligatures w14:val="none"/>
+        </w:rPr>
+        <w:tab/>
+      </w:r>
+      <w:r>
+        <w:rPr>
+          <w:rFonts w:ascii="Arial" w:eastAsia="Calibri" w:hAnsi="Arial" w:cs="Arial"/>
+          <w:kern w:val="0"/>
+          <w:sz w:val="20"/>
+          <w:szCs w:val="20"/>
+          <w14:ligatures w14:val="none"/>
+        </w:rPr>
+        <w:tab/>
+      </w:r>
+      <w:r>
+        <w:rPr>
+          <w:rFonts w:ascii="Arial" w:eastAsia="Calibri" w:hAnsi="Arial" w:cs="Arial"/>
+          <w:kern w:val="0"/>
+          <w:sz w:val="20"/>
+          <w:szCs w:val="20"/>
+          <w14:ligatures w14:val="none"/>
+        </w:rPr>
+        <w:tab/>
+      </w:r>
+      <w:r>
+        <w:rPr>
+          <w:rFonts w:ascii="Arial" w:eastAsia="Calibri" w:hAnsi="Arial" w:cs="Arial"/>
+          <w:kern w:val="0"/>
+          <w:sz w:val="20"/>
+          <w:szCs w:val="20"/>
+          <w14:ligatures w14:val="none"/>
+        </w:rPr>
+        <w:tab/>
+      </w:r>
+      <w:r>
+        <w:rPr>
+          <w:rFonts w:ascii="Arial" w:eastAsia="Calibri" w:hAnsi="Arial" w:cs="Arial"/>
+          <w:kern w:val="0"/>
+          <w:sz w:val="20"/>
+          <w:szCs w:val="20"/>
+          <w14:ligatures w14:val="none"/>
+        </w:rPr>
+        <w:tab/>
+      </w:r>
+    </w:p>
+    <w:p>
+      <w:pPr>
+        <w:spacing w:after="0" w:line="276" w:lineRule="auto"/>
+        <w:jc w:val="both"/>
+        <w:rPr>
+          <w:rFonts w:ascii="Arial" w:eastAsia="Calibri" w:hAnsi="Arial" w:cs="Arial"/>
+          <w:b/>
+          <w:kern w:val="0"/>
+          <w:sz w:val="20"/>
+          <w:szCs w:val="20"/>
+          <w14:ligatures w14:val="none"/>
+        </w:rPr>
+      </w:pPr>
+      <w:r>
+        <w:rPr>
+          <w:rFonts w:ascii="Arial" w:eastAsia="Calibri" w:hAnsi="Arial" w:cs="Arial"/>
+          <w:kern w:val="0"/>
+          <w:sz w:val="20"/>
+          <w:szCs w:val="20"/>
+          <w14:ligatures w14:val="none"/>
+        </w:rPr>
+        <w:tab/>
+      </w:r>
+      <w:r>
+        <w:rPr>
+          <w:rFonts w:ascii="Arial" w:eastAsia="Calibri" w:hAnsi="Arial" w:cs="Arial"/>
+          <w:kern w:val="0"/>
+          <w:sz w:val="20"/>
+          <w:szCs w:val="20"/>
+          <w14:ligatures w14:val="none"/>
+        </w:rPr>
+        <w:tab/>
+      </w:r>
+      <w:r>
+        <w:rPr>
+          <w:rFonts w:ascii="Arial" w:eastAsia="Calibri" w:hAnsi="Arial" w:cs="Arial"/>
+          <w:kern w:val="0"/>
+          <w:sz w:val="20"/>
+          <w:szCs w:val="20"/>
+          <w14:ligatures w14:val="none"/>
+        </w:rPr>
+        <w:tab/>
+      </w:r>
+      <w:r>
+        <w:rPr>
+          <w:rFonts w:ascii="Arial" w:eastAsia="Calibri" w:hAnsi="Arial" w:cs="Arial"/>
+          <w:kern w:val="0"/>
+          <w:sz w:val="20"/>
+          <w:szCs w:val="20"/>
+          <w14:ligatures w14:val="none"/>
+        </w:rPr>
+        <w:tab/>
+      </w:r>
+      <w:r>
+        <w:rPr>
+          <w:rFonts w:ascii="Arial" w:eastAsia="Calibri" w:hAnsi="Arial" w:cs="Arial"/>
+          <w:kern w:val="0"/>
+          <w:sz w:val="20"/>
+          <w:szCs w:val="20"/>
+          <w14:ligatures w14:val="none"/>
+        </w:rPr>
+        <w:tab/>
+      </w:r>
+      <w:r>
+        <w:rPr>
+          <w:rFonts w:ascii="Arial" w:eastAsia="Calibri" w:hAnsi="Arial" w:cs="Arial"/>
+          <w:kern w:val="0"/>
+          <w:sz w:val="20"/>
+          <w:szCs w:val="20"/>
+          <w14:ligatures w14:val="none"/>
+        </w:rPr>
+        <w:tab/>
+      </w:r>
+      <w:r>
+        <w:rPr>
+          <w:rFonts w:ascii="Arial" w:eastAsia="Calibri" w:hAnsi="Arial" w:cs="Arial"/>
+          <w:b/>
+          <w:kern w:val="0"/>
+          <w:sz w:val="20"/>
+          <w:szCs w:val="20"/>
+          <w:u w:val="single"/>
+          <w14:ligatures w14:val="none"/>
+        </w:rPr>
+        <w:t>DECRETO</w:t>
+      </w:r>
+      <w:r>
+        <w:rPr>
+          <w:rFonts w:ascii="Arial" w:eastAsia="Calibri" w:hAnsi="Arial" w:cs="Arial"/>
+          <w:b/>
+          <w:kern w:val="0"/>
+          <w:sz w:val="20"/>
+          <w:szCs w:val="20"/>
+          <w14:ligatures w14:val="none"/>
+        </w:rPr>
+        <w:t>:</w:t>
+      </w:r>
+    </w:p>
+    <w:p>
+      <w:pPr>
+        <w:spacing w:after="0" w:line="276" w:lineRule="auto"/>
+        <w:jc w:val="both"/>
+        <w:rPr>
+          <w:rFonts w:ascii="Arial" w:eastAsia="Calibri" w:hAnsi="Arial" w:cs="Arial"/>
+          <w:b/>
+          <w:kern w:val="0"/>
+          <w:sz w:val="20"/>
+          <w:szCs w:val="20"/>
+          <w14:ligatures w14:val="none"/>
+        </w:rPr>
+      </w:pPr>
+      <w:r>
+        <w:rPr>
+          <w:rFonts w:ascii="Arial" w:eastAsia="Calibri" w:hAnsi="Arial" w:cs="Arial"/>
+          <w:b/>
+          <w:kern w:val="0"/>
+          <w:sz w:val="20"/>
+          <w:szCs w:val="20"/>
+          <w14:ligatures w14:val="none"/>
+        </w:rPr>
+        <w:tab/>
+      </w:r>
+    </w:p>
+    <w:p>
+      <w:pPr>
+        <w:spacing w:after="0" w:line="276" w:lineRule="auto"/>
+        <w:jc w:val="both"/>
+        <w:rPr>
+          <w:rFonts w:ascii="Arial" w:eastAsia="Calibri" w:hAnsi="Arial" w:cs="Arial"/>
+          <w:kern w:val="0"/>
+          <w:sz w:val="20"/>
+          <w:szCs w:val="20"/>
+          <w14:ligatures w14:val="none"/>
+        </w:rPr>
+      </w:pPr>
+      <w:r>
+        <w:rPr>
+          <w:rFonts w:ascii="Arial" w:eastAsia="Calibri" w:hAnsi="Arial" w:cs="Arial"/>
+          <w:b/>
+          <w:kern w:val="0"/>
+          <w:sz w:val="20"/>
+          <w:szCs w:val="20"/>
+          <w14:ligatures w14:val="none"/>
+        </w:rPr>
+        <w:t xml:space="preserve">                                                                            </w:t>
+      </w:r>
+      <w:r>
+        <w:rPr>
+          <w:rFonts w:ascii="Arial" w:eastAsia="Calibri" w:hAnsi="Arial" w:cs="Arial"/>
+          <w:b/>
+          <w:kern w:val="0"/>
+          <w:sz w:val="20"/>
+          <w:szCs w:val="20"/>
+          <w14:ligatures w14:val="none"/>
+        </w:rPr>
         <w:t>1</w:t>
       </w:r>
       <w:r>
@@ -1430,7 +1593,7 @@
           <w:szCs w:val="20"/>
           <w14:ligatures w14:val="none"/>
         </w:rPr>
-        <w:t>al</w:t>
+        <w:t>a</w:t>
       </w:r>
       <w:r>
         <w:rPr>
@@ -1454,6 +1617,7 @@
         </w:rPr>
         <w:t>{</w:t>
       </w:r>
+      <w:proofErr w:type="spellStart"/>
       <w:r>
         <w:rPr>
           <w:rFonts w:ascii="Arial" w:eastAsia="Calibri" w:hAnsi="Arial" w:cs="Arial"/>
@@ -1466,6 +1630,7 @@
         </w:rPr>
         <w:t>organizacion</w:t>
       </w:r>
+      <w:proofErr w:type="spellEnd"/>
       <w:r>
         <w:rPr>
           <w:rFonts w:ascii="Arial" w:eastAsia="Calibri" w:hAnsi="Arial" w:cs="Arial"/>
@@ -1509,6 +1674,7 @@
         </w:rPr>
         <w:t xml:space="preserve">io </w:t>
       </w:r>
+      <w:proofErr w:type="spellStart"/>
       <w:r>
         <w:rPr>
           <w:rFonts w:ascii="Arial" w:eastAsia="Calibri" w:hAnsi="Arial" w:cs="Arial"/>
@@ -1519,6 +1685,7 @@
         </w:rPr>
         <w:t>Nº</w:t>
       </w:r>
+      <w:proofErr w:type="spellEnd"/>
       <w:r>
         <w:rPr>
           <w:rFonts w:ascii="Arial" w:eastAsia="Calibri" w:hAnsi="Arial" w:cs="Arial"/>
@@ -1541,6 +1708,7 @@
         </w:rPr>
         <w:t>{</w:t>
       </w:r>
+      <w:proofErr w:type="spellStart"/>
       <w:r>
         <w:rPr>
           <w:rFonts w:ascii="Arial" w:eastAsia="Calibri" w:hAnsi="Arial" w:cs="Arial"/>
@@ -1553,6 +1721,7 @@
         </w:rPr>
         <w:t>rutOrganizacion</w:t>
       </w:r>
+      <w:proofErr w:type="spellEnd"/>
       <w:r>
         <w:rPr>
           <w:rFonts w:ascii="Arial" w:eastAsia="Calibri" w:hAnsi="Arial" w:cs="Arial"/>
@@ -1593,17 +1762,7 @@
           <w:szCs w:val="20"/>
           <w14:ligatures w14:val="none"/>
         </w:rPr>
-        <w:t xml:space="preserve"> do</w:t>
-      </w:r>
-      <w:r>
-        <w:rPr>
-          <w:rFonts w:ascii="Arial" w:eastAsia="Calibri" w:hAnsi="Arial" w:cs="Arial"/>
-          <w:kern w:val="0"/>
-          <w:sz w:val="20"/>
-          <w:szCs w:val="20"/>
-          <w14:ligatures w14:val="none"/>
-        </w:rPr>
-        <w:t>n</w:t>
+        <w:t>/a</w:t>
       </w:r>
       <w:r>
         <w:rPr>
@@ -1671,15 +1830,27 @@
         </w:rPr>
         <w:t xml:space="preserve"> </w:t>
       </w:r>
-      <w:r>
-        <w:rPr>
-          <w:rFonts w:ascii="Arial" w:eastAsia="Calibri" w:hAnsi="Arial" w:cs="Arial"/>
-          <w:kern w:val="0"/>
-          <w:sz w:val="20"/>
-          <w:szCs w:val="20"/>
-          <w14:ligatures w14:val="none"/>
-        </w:rPr>
-        <w:t xml:space="preserve">Nº </w:t>
+      <w:proofErr w:type="spellStart"/>
+      <w:r>
+        <w:rPr>
+          <w:rFonts w:ascii="Arial" w:eastAsia="Calibri" w:hAnsi="Arial" w:cs="Arial"/>
+          <w:kern w:val="0"/>
+          <w:sz w:val="20"/>
+          <w:szCs w:val="20"/>
+          <w14:ligatures w14:val="none"/>
+        </w:rPr>
+        <w:t>Nº</w:t>
+      </w:r>
+      <w:proofErr w:type="spellEnd"/>
+      <w:r>
+        <w:rPr>
+          <w:rFonts w:ascii="Arial" w:eastAsia="Calibri" w:hAnsi="Arial" w:cs="Arial"/>
+          <w:kern w:val="0"/>
+          <w:sz w:val="20"/>
+          <w:szCs w:val="20"/>
+          <w14:ligatures w14:val="none"/>
+        </w:rPr>
+        <w:t xml:space="preserve"> </w:t>
       </w:r>
       <w:r>
         <w:rPr>
@@ -1693,6 +1864,7 @@
         </w:rPr>
         <w:t>{</w:t>
       </w:r>
+      <w:proofErr w:type="spellStart"/>
       <w:r>
         <w:rPr>
           <w:rFonts w:ascii="Arial" w:eastAsia="Calibri" w:hAnsi="Arial" w:cs="Arial"/>
@@ -1705,6 +1877,7 @@
         </w:rPr>
         <w:t>rutPresidente</w:t>
       </w:r>
+      <w:proofErr w:type="spellEnd"/>
       <w:r>
         <w:rPr>
           <w:rFonts w:ascii="Arial" w:eastAsia="Calibri" w:hAnsi="Arial" w:cs="Arial"/>
@@ -1895,7 +2068,20 @@
           <w:lang w:val="es-ES" w:eastAsia="es-ES"/>
           <w14:ligatures w14:val="none"/>
         </w:rPr>
-        <w:t xml:space="preserve">      </w:t>
+        <w:t xml:space="preserve">   </w:t>
+      </w:r>
+      <w:proofErr w:type="gramStart"/>
+      <w:r>
+        <w:rPr>
+          <w:rFonts w:ascii="Arial" w:eastAsiaTheme="minorEastAsia" w:hAnsi="Arial" w:cs="Arial"/>
+          <w:b/>
+          <w:kern w:val="0"/>
+          <w:sz w:val="20"/>
+          <w:szCs w:val="20"/>
+          <w:lang w:val="es-ES" w:eastAsia="es-ES"/>
+          <w14:ligatures w14:val="none"/>
+        </w:rPr>
+        <w:t xml:space="preserve">   </w:t>
       </w:r>
       <w:r>
         <w:rPr>
@@ -1909,6 +2095,8 @@
         </w:rPr>
         <w:t>{</w:t>
       </w:r>
+      <w:proofErr w:type="spellStart"/>
+      <w:proofErr w:type="gramEnd"/>
       <w:r>
         <w:rPr>
           <w:rFonts w:ascii="Arial" w:eastAsiaTheme="minorEastAsia" w:hAnsi="Arial" w:cs="Arial"/>
@@ -1921,6 +2109,45 @@
         </w:rPr>
         <w:t>fechaInicio</w:t>
       </w:r>
+      <w:proofErr w:type="spellEnd"/>
+      <w:r>
+        <w:rPr>
+          <w:rFonts w:ascii="Arial" w:eastAsiaTheme="minorEastAsia" w:hAnsi="Arial" w:cs="Arial"/>
+          <w:b/>
+          <w:kern w:val="0"/>
+          <w:sz w:val="20"/>
+          <w:szCs w:val="20"/>
+          <w:lang w:val="es-ES" w:eastAsia="es-ES"/>
+          <w14:ligatures w14:val="none"/>
+        </w:rPr>
+        <w:t>}</w:t>
+      </w:r>
+      <w:r>
+        <w:rPr>
+          <w:rFonts w:ascii="Arial" w:eastAsiaTheme="minorEastAsia" w:hAnsi="Arial" w:cs="Arial"/>
+          <w:b/>
+          <w:kern w:val="0"/>
+          <w:sz w:val="20"/>
+          <w:szCs w:val="20"/>
+          <w:lang w:val="es-ES" w:eastAsia="es-ES"/>
+          <w14:ligatures w14:val="none"/>
+        </w:rPr>
+        <w:t xml:space="preserve"> – {</w:t>
+      </w:r>
+      <w:proofErr w:type="spellStart"/>
+      <w:r>
+        <w:rPr>
+          <w:rFonts w:ascii="Arial" w:eastAsiaTheme="minorEastAsia" w:hAnsi="Arial" w:cs="Arial"/>
+          <w:b/>
+          <w:kern w:val="0"/>
+          <w:sz w:val="20"/>
+          <w:szCs w:val="20"/>
+          <w:lang w:val="es-ES" w:eastAsia="es-ES"/>
+          <w14:ligatures w14:val="none"/>
+        </w:rPr>
+        <w:t>fechaTermino</w:t>
+      </w:r>
+      <w:proofErr w:type="spellEnd"/>
       <w:r>
         <w:rPr>
           <w:rFonts w:ascii="Arial" w:eastAsiaTheme="minorEastAsia" w:hAnsi="Arial" w:cs="Arial"/>
@@ -1987,20 +2214,33 @@
           <w:lang w:val="es-ES" w:eastAsia="es-ES"/>
           <w14:ligatures w14:val="none"/>
         </w:rPr>
-        <w:t xml:space="preserve">   </w:t>
-      </w:r>
-      <w:r>
-        <w:rPr>
-          <w:rFonts w:ascii="Arial" w:eastAsiaTheme="minorEastAsia" w:hAnsi="Arial" w:cs="Arial"/>
-          <w:b/>
-          <w:kern w:val="0"/>
-          <w:sz w:val="20"/>
-          <w:szCs w:val="20"/>
-          <w:lang w:val="es-ES" w:eastAsia="es-ES"/>
-          <w14:ligatures w14:val="none"/>
-        </w:rPr>
         <w:t xml:space="preserve"> </w:t>
       </w:r>
+      <w:proofErr w:type="gramStart"/>
+      <w:r>
+        <w:rPr>
+          <w:rFonts w:ascii="Arial" w:eastAsiaTheme="minorEastAsia" w:hAnsi="Arial" w:cs="Arial"/>
+          <w:b/>
+          <w:kern w:val="0"/>
+          <w:sz w:val="20"/>
+          <w:szCs w:val="20"/>
+          <w:lang w:val="es-ES" w:eastAsia="es-ES"/>
+          <w14:ligatures w14:val="none"/>
+        </w:rPr>
+        <w:t xml:space="preserve">  </w:t>
+      </w:r>
+      <w:r>
+        <w:rPr>
+          <w:rFonts w:ascii="Arial" w:eastAsiaTheme="minorEastAsia" w:hAnsi="Arial" w:cs="Arial"/>
+          <w:b/>
+          <w:kern w:val="0"/>
+          <w:sz w:val="20"/>
+          <w:szCs w:val="20"/>
+          <w:lang w:val="es-ES" w:eastAsia="es-ES"/>
+          <w14:ligatures w14:val="none"/>
+        </w:rPr>
+        <w:t xml:space="preserve"> </w:t>
+      </w:r>
       <w:r>
         <w:rPr>
           <w:rFonts w:ascii="Arial" w:eastAsiaTheme="minorEastAsia" w:hAnsi="Arial" w:cs="Arial"/>
@@ -2014,6 +2254,8 @@
         </w:rPr>
         <w:t>{</w:t>
       </w:r>
+      <w:proofErr w:type="spellStart"/>
+      <w:proofErr w:type="gramEnd"/>
       <w:r>
         <w:rPr>
           <w:rFonts w:ascii="Arial" w:eastAsiaTheme="minorEastAsia" w:hAnsi="Arial" w:cs="Arial"/>
@@ -2027,6 +2269,7 @@
         </w:rPr>
         <w:t>ubicacion</w:t>
       </w:r>
+      <w:proofErr w:type="spellEnd"/>
       <w:r>
         <w:rPr>
           <w:rFonts w:ascii="Arial" w:eastAsiaTheme="minorEastAsia" w:hAnsi="Arial" w:cs="Arial"/>
@@ -2157,6 +2400,7 @@
         </w:rPr>
         <w:t>{</w:t>
       </w:r>
+      <w:proofErr w:type="spellStart"/>
       <w:r>
         <w:rPr>
           <w:rFonts w:ascii="Arial" w:eastAsiaTheme="minorEastAsia" w:hAnsi="Arial" w:cs="Arial"/>
@@ -2169,6 +2413,7 @@
         </w:rPr>
         <w:t>horaInicio</w:t>
       </w:r>
+      <w:proofErr w:type="spellEnd"/>
       <w:r>
         <w:rPr>
           <w:rFonts w:ascii="Arial" w:eastAsiaTheme="minorEastAsia" w:hAnsi="Arial" w:cs="Arial"/>
@@ -2205,6 +2450,7 @@
         </w:rPr>
         <w:t>{</w:t>
       </w:r>
+      <w:proofErr w:type="spellStart"/>
       <w:r>
         <w:rPr>
           <w:rFonts w:ascii="Arial" w:eastAsiaTheme="minorEastAsia" w:hAnsi="Arial" w:cs="Arial"/>
@@ -2217,6 +2463,7 @@
         </w:rPr>
         <w:t>horaTermino</w:t>
       </w:r>
+      <w:proofErr w:type="spellEnd"/>
       <w:r>
         <w:rPr>
           <w:rFonts w:ascii="Arial" w:eastAsiaTheme="minorEastAsia" w:hAnsi="Arial" w:cs="Arial"/>
@@ -2415,22 +2662,125 @@
       <w:r>
         <w:rPr>
           <w:rFonts w:ascii="Arial" w:eastAsia="Calibri" w:hAnsi="Arial" w:cs="Arial"/>
-          <w:kern w:val="0"/>
-          <w:sz w:val="20"/>
-          <w:szCs w:val="20"/>
-          <w14:ligatures w14:val="none"/>
-        </w:rPr>
-        <w:t xml:space="preserve">Exento de derechos municipales de acuerdo al artículo 26 de la Ordenanza </w:t>
-      </w:r>
-      <w:r>
-        <w:rPr>
-          <w:rFonts w:ascii="Arial" w:eastAsia="Calibri" w:hAnsi="Arial" w:cs="Arial"/>
-          <w:kern w:val="0"/>
-          <w:sz w:val="20"/>
-          <w:szCs w:val="20"/>
-          <w14:ligatures w14:val="none"/>
-        </w:rPr>
-        <w:t>local por concepto de Derechos Municipales, concesiones o permisos N° 03 de fecha 09 de agosto de 2024.</w:t>
+          <w:b/>
+          <w:kern w:val="0"/>
+          <w:sz w:val="20"/>
+          <w:szCs w:val="20"/>
+          <w14:ligatures w14:val="none"/>
+        </w:rPr>
+        <w:t>AUTORIZASE</w:t>
+      </w:r>
+      <w:r>
+        <w:rPr>
+          <w:rFonts w:ascii="Arial" w:eastAsia="Calibri" w:hAnsi="Arial" w:cs="Arial"/>
+          <w:kern w:val="0"/>
+          <w:sz w:val="20"/>
+          <w:szCs w:val="20"/>
+          <w14:ligatures w14:val="none"/>
+        </w:rPr>
+        <w:t xml:space="preserve"> la venta de alimentos en el evento, Según indica el formulario de la autoridad sanitaria de la provincia de Chiloé</w:t>
+      </w:r>
+    </w:p>
+    <w:p>
+      <w:pPr>
+        <w:spacing w:after="0" w:line="276" w:lineRule="auto"/>
+        <w:jc w:val="both"/>
+        <w:rPr>
+          <w:rFonts w:ascii="Arial" w:eastAsia="Calibri" w:hAnsi="Arial" w:cs="Arial"/>
+          <w:kern w:val="0"/>
+          <w:sz w:val="20"/>
+          <w:szCs w:val="20"/>
+          <w14:ligatures w14:val="none"/>
+        </w:rPr>
+      </w:pPr>
+    </w:p>
+    <w:p>
+      <w:pPr>
+        <w:spacing w:after="0" w:line="276" w:lineRule="auto"/>
+        <w:ind w:firstLine="4111"/>
+        <w:jc w:val="both"/>
+        <w:rPr>
+          <w:rFonts w:ascii="Arial" w:eastAsia="Calibri" w:hAnsi="Arial" w:cs="Arial"/>
+          <w:kern w:val="0"/>
+          <w:sz w:val="20"/>
+          <w:szCs w:val="20"/>
+          <w14:ligatures w14:val="none"/>
+        </w:rPr>
+      </w:pPr>
+      <w:r>
+        <w:rPr>
+          <w:rFonts w:ascii="Arial" w:eastAsia="Calibri" w:hAnsi="Arial" w:cs="Arial"/>
+          <w:b/>
+          <w:kern w:val="0"/>
+          <w:sz w:val="20"/>
+          <w:szCs w:val="20"/>
+          <w14:ligatures w14:val="none"/>
+        </w:rPr>
+        <w:t xml:space="preserve">3.- </w:t>
+      </w:r>
+      <w:r>
+        <w:rPr>
+          <w:rFonts w:ascii="Arial" w:eastAsia="Calibri" w:hAnsi="Arial" w:cs="Arial"/>
+          <w:kern w:val="0"/>
+          <w:sz w:val="20"/>
+          <w:szCs w:val="20"/>
+          <w14:ligatures w14:val="none"/>
+        </w:rPr>
+        <w:t xml:space="preserve">Exento de derechos municipales </w:t>
+      </w:r>
+      <w:proofErr w:type="gramStart"/>
+      <w:r>
+        <w:rPr>
+          <w:rFonts w:ascii="Arial" w:eastAsia="Calibri" w:hAnsi="Arial" w:cs="Arial"/>
+          <w:kern w:val="0"/>
+          <w:sz w:val="20"/>
+          <w:szCs w:val="20"/>
+          <w14:ligatures w14:val="none"/>
+        </w:rPr>
+        <w:t>de acuerdo al</w:t>
+      </w:r>
+      <w:proofErr w:type="gramEnd"/>
+      <w:r>
+        <w:rPr>
+          <w:rFonts w:ascii="Arial" w:eastAsia="Calibri" w:hAnsi="Arial" w:cs="Arial"/>
+          <w:kern w:val="0"/>
+          <w:sz w:val="20"/>
+          <w:szCs w:val="20"/>
+          <w14:ligatures w14:val="none"/>
+        </w:rPr>
+        <w:t xml:space="preserve"> artículo 26 de la Ordenanza local por concepto de Derechos Municipales, concesiones o permisos </w:t>
+      </w:r>
+      <w:proofErr w:type="spellStart"/>
+      <w:r>
+        <w:rPr>
+          <w:rFonts w:ascii="Arial" w:eastAsia="Calibri" w:hAnsi="Arial" w:cs="Arial"/>
+          <w:kern w:val="0"/>
+          <w:sz w:val="20"/>
+          <w:szCs w:val="20"/>
+          <w14:ligatures w14:val="none"/>
+        </w:rPr>
+        <w:t>N°</w:t>
+      </w:r>
+      <w:proofErr w:type="spellEnd"/>
+      <w:r>
+        <w:rPr>
+          <w:rFonts w:ascii="Arial" w:eastAsia="Calibri" w:hAnsi="Arial" w:cs="Arial"/>
+          <w:kern w:val="0"/>
+          <w:sz w:val="20"/>
+          <w:szCs w:val="20"/>
+          <w14:ligatures w14:val="none"/>
+        </w:rPr>
+        <w:t xml:space="preserve"> 05 de fecha 29 de octubre de 2024.</w:t>
+      </w:r>
+      <w:r>
+        <w:rPr>
+          <w:rFonts w:ascii="Arial" w:eastAsia="Calibri" w:hAnsi="Arial" w:cs="Arial"/>
+          <w:kern w:val="0"/>
+          <w:sz w:val="20"/>
+          <w:szCs w:val="20"/>
+          <w14:ligatures w14:val="none"/>
+        </w:rPr>
+        <w:tab/>
       </w:r>
       <w:r>
         <w:rPr>
@@ -2577,7 +2927,31 @@
           <w:lang w:val="es-ES" w:eastAsia="es-ES"/>
           <w14:ligatures w14:val="none"/>
         </w:rPr>
-        <w:t>para su posterior revisión de la Contraloría Regional, Xa. Región “Los Lagos”.</w:t>
+        <w:t xml:space="preserve">para su posterior revisión de la Contraloría Regional, </w:t>
+      </w:r>
+      <w:proofErr w:type="spellStart"/>
+      <w:r>
+        <w:rPr>
+          <w:rFonts w:ascii="Arial" w:eastAsiaTheme="minorEastAsia" w:hAnsi="Arial" w:cs="Arial"/>
+          <w:kern w:val="0"/>
+          <w:sz w:val="20"/>
+          <w:szCs w:val="20"/>
+          <w:lang w:val="es-ES" w:eastAsia="es-ES"/>
+          <w14:ligatures w14:val="none"/>
+        </w:rPr>
+        <w:t>Xa</w:t>
+      </w:r>
+      <w:proofErr w:type="spellEnd"/>
+      <w:r>
+        <w:rPr>
+          <w:rFonts w:ascii="Arial" w:eastAsiaTheme="minorEastAsia" w:hAnsi="Arial" w:cs="Arial"/>
+          <w:kern w:val="0"/>
+          <w:sz w:val="20"/>
+          <w:szCs w:val="20"/>
+          <w:lang w:val="es-ES" w:eastAsia="es-ES"/>
+          <w14:ligatures w14:val="none"/>
+        </w:rPr>
+        <w:t>. Región “Los Lagos”.</w:t>
       </w:r>
       <w:r>
         <w:rPr>
@@ -2955,17 +3329,32 @@
           <w14:ligatures w14:val="none"/>
         </w:rPr>
       </w:pPr>
-      <w:r>
-        <w:rPr>
-          <w:rFonts w:ascii="Arial" w:eastAsia="Calibri" w:hAnsi="Arial" w:cs="Arial"/>
-          <w:b/>
-          <w:kern w:val="0"/>
-          <w:sz w:val="20"/>
-          <w:szCs w:val="20"/>
-          <w14:ligatures w14:val="none"/>
-        </w:rPr>
-        <w:t>caq.-</w:t>
-      </w:r>
+      <w:proofErr w:type="spellStart"/>
+      <w:proofErr w:type="gramStart"/>
+      <w:r>
+        <w:rPr>
+          <w:rFonts w:ascii="Arial" w:eastAsia="Calibri" w:hAnsi="Arial" w:cs="Arial"/>
+          <w:b/>
+          <w:kern w:val="0"/>
+          <w:sz w:val="20"/>
+          <w:szCs w:val="20"/>
+          <w14:ligatures w14:val="none"/>
+        </w:rPr>
+        <w:t>caq</w:t>
+      </w:r>
+      <w:proofErr w:type="spellEnd"/>
+      <w:r>
+        <w:rPr>
+          <w:rFonts w:ascii="Arial" w:eastAsia="Calibri" w:hAnsi="Arial" w:cs="Arial"/>
+          <w:b/>
+          <w:kern w:val="0"/>
+          <w:sz w:val="20"/>
+          <w:szCs w:val="20"/>
+          <w14:ligatures w14:val="none"/>
+        </w:rPr>
+        <w:t>.-</w:t>
+      </w:r>
+      <w:proofErr w:type="gramEnd"/>
     </w:p>
     <w:p>
       <w:pPr>
@@ -3070,6 +3459,7 @@
           <w:szCs w:val="20"/>
           <w14:ligatures w14:val="none"/>
         </w:rPr>
+        <w:lastRenderedPageBreak/>
         <w:t>- C.c. Organización Interesada.</w:t>
       </w:r>
     </w:p>
@@ -4399,7 +4789,6 @@
   <w:style w:type="character" w:default="1" w:styleId="Fuentedeprrafopredeter">
     <w:name w:val="Default Paragraph Font"/>
     <w:uiPriority w:val="1"/>
-    <w:semiHidden/>
     <w:unhideWhenUsed/>
   </w:style>
   <w:style w:type="table" w:default="1" w:styleId="Tablanormal">

</xml_diff>